<commit_message>
tree-survey-fix: edit docs/Resell_Module.docx (5-app coverage · Gen 115)
Fix C: Admin port :3003 -> :3000 (WeeeT=:3003, Admin=:3000)
Fix A: Add WeeeR 19 screens (R-66/67/67b/67c/15/16/41/15c/15b/17/19/18/20/23/21/22/68/69/69b)
Fix A: Add Admin 10 screens (A-12/12b/13/14/37 in-chain + A-34/35/35b/36/38)
Fix A: Add Website 2 screens (W-11/W-12, D71 public entry localhost:3004)
Fix mismatch: U-RES-REV nav U-04 -> U-47 (/sell canonical)
Fix mismatch: U-21/U-23 case tag R9 -> R3 (marketplace browse = R3 buyer flow)
Replace placeholders: [A-LST-SUS]->A-12b [R-RES-LST]->R-17 [R-RES-LST-DET]->R-19
  [R-RES-TX]->R-69b [U-SLL-DET]->U-47c [R-RES-PUR]->R-23 [R-WALLET]->R-wallet
  [U-RES-PAY]->U-19b [A-RES-DSP]->A-13 [R-18]->R-18 (remove brackets)
Table: 48 rows (header + 4 sections + 12 WeeeU + 19 WeeeR + 10 Admin + 2 Website)
base c151e53, registry authoritative Gen 114

Co-Authored-By: Claude Sonnet 4.6 <noreply@anthropic.com>
</commit_message>
<xml_diff>
--- a/docs/Resell_Module.docx
+++ b/docs/Resell_Module.docx
@@ -11,7 +11,7 @@
         <w:rPr>
           <w:sz w:val="32"/>
         </w:rPr>
-        <w:t>Resell Module — P3 Flow File</w:t>
+        <w:t>Resell Module — Flow File (5-App Coverage)</w:t>
       </w:r>
     </w:p>
     <w:p>
@@ -23,7 +23,7 @@
           <w:color w:val="666666"/>
           <w:sz w:val="18"/>
         </w:rPr>
-        <w:t>App3R-Resell · WeeeU · Cases R1-R12 · Cross-App §5/§6/§8 · localhost:3002 links · base da0e3a9 · branch feature/resell-p2p3 · SHA c5fa99c</w:t>
+        <w:t>App3R-Resell · 5-App · Cases R1-R12 · Cross-App §5/§6/§8 · WeeeU:3002 + WeeeR:3001 + Admin:3000 + Website:3004 · base da0e3a9 · branch feature/reforward-resell-docx · SHA c5fa99c</w:t>
       </w:r>
     </w:p>
     <w:p/>
@@ -221,6 +221,119 @@
         </w:tc>
       </w:tr>
       <w:tr>
+        <w:trPr>
+          <w:trHeight w:val="454"/>
+        </w:trPr>
+        <w:tc>
+          <w:tcPr>
+            <w:tcW w:type="dxa" w:w="1247"/>
+            <w:shd w:val="clear" w:color="auto" w:fill="2E7D32"/>
+          </w:tcPr>
+          <w:p>
+            <w:pPr>
+              <w:jc w:val="center"/>
+            </w:pPr>
+            <w:r>
+              <w:rPr>
+                <w:b/>
+                <w:sz w:val="18"/>
+                <w:szCs w:val="18"/>
+                <w:color w:val="FFFFFF"/>
+              </w:rPr>
+              <w:t xml:space="preserve">🟢 WeeeU (localhost:3002) — 12 จอ · Seller + Buyer + Shared Resell</w:t>
+            </w:r>
+          </w:p>
+        </w:tc>
+        <w:tc>
+          <w:tcPr>
+            <w:tcW w:type="dxa" w:w="1984"/>
+            <w:shd w:val="clear" w:color="auto" w:fill="2E7D32"/>
+          </w:tcPr>
+          <w:p>
+            <w:pPr>
+              <w:jc w:val="center"/>
+            </w:pPr>
+          </w:p>
+        </w:tc>
+        <w:tc>
+          <w:tcPr>
+            <w:tcW w:type="dxa" w:w="1701"/>
+            <w:shd w:val="clear" w:color="auto" w:fill="2E7D32"/>
+          </w:tcPr>
+          <w:p>
+            <w:pPr>
+              <w:jc w:val="center"/>
+            </w:pPr>
+          </w:p>
+        </w:tc>
+        <w:tc>
+          <w:tcPr>
+            <w:tcW w:type="dxa" w:w="1984"/>
+            <w:shd w:val="clear" w:color="auto" w:fill="2E7D32"/>
+          </w:tcPr>
+          <w:p>
+            <w:pPr>
+              <w:jc w:val="center"/>
+            </w:pPr>
+          </w:p>
+        </w:tc>
+        <w:tc>
+          <w:tcPr>
+            <w:tcW w:type="dxa" w:w="1701"/>
+            <w:shd w:val="clear" w:color="auto" w:fill="2E7D32"/>
+          </w:tcPr>
+          <w:p>
+            <w:pPr>
+              <w:jc w:val="center"/>
+            </w:pPr>
+          </w:p>
+        </w:tc>
+        <w:tc>
+          <w:tcPr>
+            <w:tcW w:type="dxa" w:w="1814"/>
+            <w:shd w:val="clear" w:color="auto" w:fill="2E7D32"/>
+          </w:tcPr>
+          <w:p>
+            <w:pPr>
+              <w:jc w:val="center"/>
+            </w:pPr>
+          </w:p>
+        </w:tc>
+        <w:tc>
+          <w:tcPr>
+            <w:tcW w:type="dxa" w:w="907"/>
+            <w:shd w:val="clear" w:color="auto" w:fill="2E7D32"/>
+          </w:tcPr>
+          <w:p>
+            <w:pPr>
+              <w:jc w:val="center"/>
+            </w:pPr>
+          </w:p>
+        </w:tc>
+        <w:tc>
+          <w:tcPr>
+            <w:tcW w:type="dxa" w:w="1701"/>
+            <w:shd w:val="clear" w:color="auto" w:fill="2E7D32"/>
+          </w:tcPr>
+          <w:p>
+            <w:pPr>
+              <w:jc w:val="center"/>
+            </w:pPr>
+          </w:p>
+        </w:tc>
+        <w:tc>
+          <w:tcPr>
+            <w:tcW w:type="dxa" w:w="1984"/>
+            <w:shd w:val="clear" w:color="auto" w:fill="2E7D32"/>
+          </w:tcPr>
+          <w:p>
+            <w:pPr>
+              <w:jc w:val="center"/>
+            </w:pPr>
+          </w:p>
+        </w:tc>
+      </w:tr>
+      <w:tr>
         <w:tc>
           <w:tcPr>
             <w:tcW w:type="dxa" w:w="1247"/>
@@ -313,7 +426,7 @@
               <w:rPr>
                 <w:sz w:val="15"/>
               </w:rPr>
-              <w:t>Admin :3003 เห็นประกาศใหม่</w:t>
+              <w:t>Admin :3000 เห็นประกาศใหม่</w:t>
               <w:br/>
               <w:t>รอตรวจสอบ</w:t>
             </w:r>
@@ -461,11 +574,11 @@
               <w:rPr>
                 <w:sz w:val="15"/>
               </w:rPr>
-              <w:t>R2: Admin :3003 [A-LST-SUS]</w:t>
+              <w:t>R2: Admin :3000 A-12b</w:t>
               <w:br/>
               <w:t>เห็น suspension + appeal</w:t>
               <w:br/>
-              <w:t>R5: WeeeU :3002 [U-RES-PAY]</w:t>
+              <w:t>R5: WeeeU :3002 U-19b</w:t>
               <w:br/>
               <w:t>ผู้ซื้อรอชำระ</w:t>
             </w:r>
@@ -577,7 +690,7 @@
               <w:rPr>
                 <w:sz w:val="15"/>
               </w:rPr>
-              <w:t>R9: เรียกดูรายการ marketplace</w:t>
+              <w:t>R3: เรียกดูรายการ marketplace</w:t>
               <w:br/>
               <w:t>Filter: category/condition/price</w:t>
               <w:br/>
@@ -611,7 +724,7 @@
               <w:rPr>
                 <w:sz w:val="15"/>
               </w:rPr>
-              <w:t>WeeeR :3001 [R-RES-LST]</w:t>
+              <w:t>WeeeR :3001 R-17</w:t>
               <w:br/>
               <w:t>เห็นรายการประกาศทั้งหมด</w:t>
             </w:r>
@@ -627,7 +740,7 @@
               <w:rPr>
                 <w:sz w:val="15"/>
               </w:rPr>
-              <w:t>R9</w:t>
+              <w:t>R3</w:t>
             </w:r>
           </w:p>
         </w:tc>
@@ -719,7 +832,7 @@
               <w:rPr>
                 <w:sz w:val="15"/>
               </w:rPr>
-              <w:t>R9: ดูรายละเอียด → ยื่นข้อเสนอ</w:t>
+              <w:t>R3: ดูรายละเอียด → ยื่นข้อเสนอ</w:t>
               <w:br/>
               <w:t>WeeeR seller เห็นประกาศตัวเอง</w:t>
             </w:r>
@@ -751,11 +864,11 @@
               <w:rPr>
                 <w:sz w:val="15"/>
               </w:rPr>
-              <w:t>WeeeR :3001 [R-RES-LST-DET]</w:t>
+              <w:t>WeeeR :3001 R-19</w:t>
               <w:br/>
               <w:t>seller เห็นประกาศ + offer count</w:t>
               <w:br/>
-              <w:t>WeeeU :3002 [U-SLL-DET]</w:t>
+              <w:t>WeeeU :3002 U-47c</w:t>
               <w:br/>
               <w:t>ถ้า WeeeU เป็น seller</w:t>
             </w:r>
@@ -771,7 +884,7 @@
               <w:rPr>
                 <w:sz w:val="15"/>
               </w:rPr>
-              <w:t>R9</w:t>
+              <w:t>R3</w:t>
             </w:r>
           </w:p>
         </w:tc>
@@ -905,7 +1018,7 @@
               <w:rPr>
                 <w:sz w:val="15"/>
               </w:rPr>
-              <w:t>WeeeR :3001 [R-18]</w:t>
+              <w:t>WeeeR :3001 R-18</w:t>
               <w:br/>
               <w:t>seller เห็น offer +1</w:t>
               <w:br/>
@@ -1053,7 +1166,7 @@
               <w:rPr>
                 <w:sz w:val="15"/>
               </w:rPr>
-              <w:t>WeeeR :3001 [R-18]</w:t>
+              <w:t>WeeeR :3001 R-18</w:t>
               <w:br/>
               <w:t>seller เห็น offer ใหม่</w:t>
             </w:r>
@@ -1205,11 +1318,11 @@
               <w:rPr>
                 <w:sz w:val="15"/>
               </w:rPr>
-              <w:t>WeeeR :3001 [R-RES-TX]</w:t>
+              <w:t>WeeeR :3001 R-69b</w:t>
               <w:br/>
               <w:t>seller เห็น transaction</w:t>
               <w:br/>
-              <w:t>WeeeU :3002 [U-SLL-DET]</w:t>
+              <w:t>WeeeU :3002 U-47c</w:t>
               <w:br/>
               <w:t>seller passive view</w:t>
             </w:r>
@@ -1365,15 +1478,15 @@
               <w:rPr>
                 <w:sz w:val="15"/>
               </w:rPr>
-              <w:t>R7: WeeeR :3001 [R-RES-PUR]</w:t>
+              <w:t>R7: WeeeR :3001 R-23</w:t>
               <w:br/>
               <w:t>WeeeR buyer ติดตาม</w:t>
               <w:br/>
-              <w:t>R10: WeeeR :3001 [R-WALLET]</w:t>
+              <w:t>R10: WeeeR :3001 R-wallet</w:t>
               <w:br/>
               <w:t>Gold เข้า wallet seller</w:t>
               <w:br/>
-              <w:t>Admin :3003 [A-RES-DSP]</w:t>
+              <w:t>Admin :3000 A-13</w:t>
               <w:br/>
               <w:t>เมื่อ disputed</w:t>
             </w:r>
@@ -1509,7 +1622,7 @@
               </w:rPr>
               <w:t>U-RES-REV-OK (done banner)</w:t>
               <w:br/>
-              <w:t>→ U-04 /sell หรือ U-21 /marketplace</w:t>
+              <w:t>→ U-47 /sell หรือ U-21 /marketplace</w:t>
             </w:r>
           </w:p>
         </w:tc>
@@ -1523,11 +1636,11 @@
               <w:rPr>
                 <w:sz w:val="15"/>
               </w:rPr>
-              <w:t>WeeeR :3001 [R-WALLET]</w:t>
+              <w:t>WeeeR :3001 R-wallet</w:t>
               <w:br/>
               <w:t>Gold ยืนยันเข้า wallet</w:t>
               <w:br/>
-              <w:t>Admin /resell/transactions</w:t>
+              <w:t>Admin :3000 /resell/lifecycle (A-37)</w:t>
               <w:br/>
               <w:t>บันทึก completed</w:t>
             </w:r>
@@ -1809,7 +1922,7 @@
               <w:rPr>
                 <w:sz w:val="15"/>
               </w:rPr>
-              <w:t>Admin :3003 เห็นประกาศใหม่</w:t>
+              <w:t>Admin :3000 เห็นประกาศใหม่</w:t>
             </w:r>
           </w:p>
         </w:tc>
@@ -1990,6 +2103,4448 @@
                 <w:sz w:val="15"/>
               </w:rPr>
               <w:t>http://localhost:3002/wallet/deposit</w:t>
+            </w:r>
+          </w:p>
+        </w:tc>
+      </w:tr>
+      <w:tr>
+        <w:tc>
+          <w:tcPr>
+            <w:tcW w:type="dxa" w:w="1247"/>
+            <w:shd w:val="clear" w:color="auto" w:fill="E65100"/>
+          </w:tcPr>
+          <w:p>
+            <w:r>
+              <w:rPr>
+                <w:b/>
+                <w:color w:val="FFFFFF"/>
+                <w:sz w:val="17"/>
+              </w:rPr>
+              <w:t>🟠 WeeeR (localhost:3001) — 19 จอ (รวม R-41) · Group E Resell</w:t>
+            </w:r>
+          </w:p>
+        </w:tc>
+        <w:tc>
+          <w:tcPr>
+            <w:tcW w:type="dxa" w:w="1984"/>
+            <w:shd w:val="clear" w:color="auto" w:fill="E65100"/>
+          </w:tcPr>
+          <w:p/>
+        </w:tc>
+        <w:tc>
+          <w:tcPr>
+            <w:tcW w:type="dxa" w:w="1701"/>
+            <w:shd w:val="clear" w:color="auto" w:fill="E65100"/>
+          </w:tcPr>
+          <w:p/>
+        </w:tc>
+        <w:tc>
+          <w:tcPr>
+            <w:tcW w:type="dxa" w:w="1984"/>
+            <w:shd w:val="clear" w:color="auto" w:fill="E65100"/>
+          </w:tcPr>
+          <w:p/>
+        </w:tc>
+        <w:tc>
+          <w:tcPr>
+            <w:tcW w:type="dxa" w:w="1701"/>
+            <w:shd w:val="clear" w:color="auto" w:fill="E65100"/>
+          </w:tcPr>
+          <w:p/>
+        </w:tc>
+        <w:tc>
+          <w:tcPr>
+            <w:tcW w:type="dxa" w:w="1814"/>
+            <w:shd w:val="clear" w:color="auto" w:fill="E65100"/>
+          </w:tcPr>
+          <w:p/>
+        </w:tc>
+        <w:tc>
+          <w:tcPr>
+            <w:tcW w:type="dxa" w:w="907"/>
+            <w:shd w:val="clear" w:color="auto" w:fill="E65100"/>
+          </w:tcPr>
+          <w:p/>
+        </w:tc>
+        <w:tc>
+          <w:tcPr>
+            <w:tcW w:type="dxa" w:w="1701"/>
+            <w:shd w:val="clear" w:color="auto" w:fill="E65100"/>
+          </w:tcPr>
+          <w:p/>
+        </w:tc>
+        <w:tc>
+          <w:tcPr>
+            <w:tcW w:type="dxa" w:w="1984"/>
+            <w:shd w:val="clear" w:color="auto" w:fill="E65100"/>
+          </w:tcPr>
+          <w:p/>
+        </w:tc>
+      </w:tr>
+      <w:tr>
+        <w:tc>
+          <w:tcPr>
+            <w:tcW w:type="dxa" w:w="1247"/>
+            <w:shd w:val="clear" w:color="auto" w:fill="F8F8F8"/>
+          </w:tcPr>
+          <w:p>
+            <w:r>
+              <w:rPr>
+                <w:b/>
+                <w:color w:val="1A3A5C"/>
+                <w:sz w:val="15"/>
+              </w:rPr>
+              <w:t>R-66</w:t>
+            </w:r>
+          </w:p>
+        </w:tc>
+        <w:tc>
+          <w:tcPr>
+            <w:tcW w:type="dxa" w:w="1984"/>
+            <w:shd w:val="clear" w:color="auto" w:fill="F8F8F8"/>
+          </w:tcPr>
+          <w:p>
+            <w:r>
+              <w:rPr>
+                <w:sz w:val="15"/>
+              </w:rPr>
+              <w:t>ขายมือสอง Hub</w:t>
+              <w:br/>
+              <w:t>/resell</w:t>
+            </w:r>
+          </w:p>
+        </w:tc>
+        <w:tc>
+          <w:tcPr>
+            <w:tcW w:type="dxa" w:w="1701"/>
+            <w:shd w:val="clear" w:color="auto" w:fill="F8F8F8"/>
+          </w:tcPr>
+          <w:p>
+            <w:r>
+              <w:rPr>
+                <w:sz w:val="15"/>
+              </w:rPr>
+              <w:t>R-01 /dashboard</w:t>
+            </w:r>
+          </w:p>
+        </w:tc>
+        <w:tc>
+          <w:tcPr>
+            <w:tcW w:type="dxa" w:w="1984"/>
+            <w:shd w:val="clear" w:color="auto" w:fill="F8F8F8"/>
+          </w:tcPr>
+          <w:p>
+            <w:r>
+              <w:rPr>
+                <w:sz w:val="15"/>
+              </w:rPr>
+              <w:t>Hub ของโมดูล resell WeeeR</w:t>
+            </w:r>
+          </w:p>
+        </w:tc>
+        <w:tc>
+          <w:tcPr>
+            <w:tcW w:type="dxa" w:w="1701"/>
+            <w:shd w:val="clear" w:color="auto" w:fill="F8F8F8"/>
+          </w:tcPr>
+          <w:p>
+            <w:r>
+              <w:rPr>
+                <w:sz w:val="15"/>
+              </w:rPr>
+              <w:t>R-67 /resell/inventory</w:t>
+              <w:br/>
+              <w:t>R-15 /resell/listings</w:t>
+              <w:br/>
+              <w:t>R-17 /resell/marketplace</w:t>
+            </w:r>
+          </w:p>
+        </w:tc>
+        <w:tc>
+          <w:tcPr>
+            <w:tcW w:type="dxa" w:w="1814"/>
+            <w:shd w:val="clear" w:color="auto" w:fill="F8F8F8"/>
+          </w:tcPr>
+          <w:p>
+            <w:r>
+              <w:rPr>
+                <w:sz w:val="15"/>
+              </w:rPr>
+              <w:t>—</w:t>
+            </w:r>
+          </w:p>
+        </w:tc>
+        <w:tc>
+          <w:tcPr>
+            <w:tcW w:type="dxa" w:w="907"/>
+            <w:shd w:val="clear" w:color="auto" w:fill="F8F8F8"/>
+          </w:tcPr>
+          <w:p>
+            <w:r>
+              <w:rPr>
+                <w:sz w:val="15"/>
+              </w:rPr>
+              <w:t>นอก chain</w:t>
+            </w:r>
+          </w:p>
+        </w:tc>
+        <w:tc>
+          <w:tcPr>
+            <w:tcW w:type="dxa" w:w="1701"/>
+            <w:shd w:val="clear" w:color="auto" w:fill="F8F8F8"/>
+          </w:tcPr>
+          <w:p>
+            <w:r>
+              <w:rPr>
+                <w:sz w:val="15"/>
+              </w:rPr>
+              <w:t>Hub ไม่ผูกเคสเดียว</w:t>
+            </w:r>
+          </w:p>
+        </w:tc>
+        <w:tc>
+          <w:tcPr>
+            <w:tcW w:type="dxa" w:w="1984"/>
+            <w:shd w:val="clear" w:color="auto" w:fill="F8F8F8"/>
+          </w:tcPr>
+          <w:p>
+            <w:r>
+              <w:rPr>
+                <w:sz w:val="15"/>
+              </w:rPr>
+              <w:t>http://localhost:3001/resell</w:t>
+            </w:r>
+          </w:p>
+        </w:tc>
+      </w:tr>
+      <w:tr>
+        <w:tc>
+          <w:tcPr>
+            <w:tcW w:type="dxa" w:w="1247"/>
+            <w:shd w:val="clear" w:color="auto" w:fill="FFFFFF"/>
+          </w:tcPr>
+          <w:p>
+            <w:r>
+              <w:rPr>
+                <w:b/>
+                <w:color w:val="1A3A5C"/>
+                <w:sz w:val="15"/>
+              </w:rPr>
+              <w:t>R-67</w:t>
+            </w:r>
+          </w:p>
+        </w:tc>
+        <w:tc>
+          <w:tcPr>
+            <w:tcW w:type="dxa" w:w="1984"/>
+            <w:shd w:val="clear" w:color="auto" w:fill="FFFFFF"/>
+          </w:tcPr>
+          <w:p>
+            <w:r>
+              <w:rPr>
+                <w:sz w:val="15"/>
+              </w:rPr>
+              <w:t>คลังสินค้า</w:t>
+              <w:br/>
+              <w:t>/resell/inventory</w:t>
+            </w:r>
+          </w:p>
+        </w:tc>
+        <w:tc>
+          <w:tcPr>
+            <w:tcW w:type="dxa" w:w="1701"/>
+            <w:shd w:val="clear" w:color="auto" w:fill="FFFFFF"/>
+          </w:tcPr>
+          <w:p>
+            <w:r>
+              <w:rPr>
+                <w:sz w:val="15"/>
+              </w:rPr>
+              <w:t>R-66 /resell</w:t>
+            </w:r>
+          </w:p>
+        </w:tc>
+        <w:tc>
+          <w:tcPr>
+            <w:tcW w:type="dxa" w:w="1984"/>
+            <w:shd w:val="clear" w:color="auto" w:fill="FFFFFF"/>
+          </w:tcPr>
+          <w:p>
+            <w:r>
+              <w:rPr>
+                <w:sz w:val="15"/>
+              </w:rPr>
+              <w:t>จัดการสต๊อกสินค้ามือสอง</w:t>
+            </w:r>
+          </w:p>
+        </w:tc>
+        <w:tc>
+          <w:tcPr>
+            <w:tcW w:type="dxa" w:w="1701"/>
+            <w:shd w:val="clear" w:color="auto" w:fill="FFFFFF"/>
+          </w:tcPr>
+          <w:p>
+            <w:r>
+              <w:rPr>
+                <w:sz w:val="15"/>
+              </w:rPr>
+              <w:t>R-67b /resell/inventory/new</w:t>
+              <w:br/>
+              <w:t>R-67c /resell/inventory/[id]</w:t>
+            </w:r>
+          </w:p>
+        </w:tc>
+        <w:tc>
+          <w:tcPr>
+            <w:tcW w:type="dxa" w:w="1814"/>
+            <w:shd w:val="clear" w:color="auto" w:fill="FFFFFF"/>
+          </w:tcPr>
+          <w:p>
+            <w:r>
+              <w:rPr>
+                <w:sz w:val="15"/>
+              </w:rPr>
+              <w:t>—</w:t>
+            </w:r>
+          </w:p>
+        </w:tc>
+        <w:tc>
+          <w:tcPr>
+            <w:tcW w:type="dxa" w:w="907"/>
+            <w:shd w:val="clear" w:color="auto" w:fill="FFFFFF"/>
+          </w:tcPr>
+          <w:p>
+            <w:r>
+              <w:rPr>
+                <w:sz w:val="15"/>
+              </w:rPr>
+              <w:t>นอก chain</w:t>
+            </w:r>
+          </w:p>
+        </w:tc>
+        <w:tc>
+          <w:tcPr>
+            <w:tcW w:type="dxa" w:w="1701"/>
+            <w:shd w:val="clear" w:color="auto" w:fill="FFFFFF"/>
+          </w:tcPr>
+          <w:p>
+            <w:r>
+              <w:rPr>
+                <w:sz w:val="15"/>
+              </w:rPr>
+              <w:t>Inventory management</w:t>
+            </w:r>
+          </w:p>
+        </w:tc>
+        <w:tc>
+          <w:tcPr>
+            <w:tcW w:type="dxa" w:w="1984"/>
+            <w:shd w:val="clear" w:color="auto" w:fill="FFFFFF"/>
+          </w:tcPr>
+          <w:p>
+            <w:r>
+              <w:rPr>
+                <w:sz w:val="15"/>
+              </w:rPr>
+              <w:t>http://localhost:3001/resell/inventory</w:t>
+            </w:r>
+          </w:p>
+        </w:tc>
+      </w:tr>
+      <w:tr>
+        <w:tc>
+          <w:tcPr>
+            <w:tcW w:type="dxa" w:w="1247"/>
+            <w:shd w:val="clear" w:color="auto" w:fill="F8F8F8"/>
+          </w:tcPr>
+          <w:p>
+            <w:r>
+              <w:rPr>
+                <w:b/>
+                <w:color w:val="1A3A5C"/>
+                <w:sz w:val="15"/>
+              </w:rPr>
+              <w:t>R-67b</w:t>
+            </w:r>
+          </w:p>
+        </w:tc>
+        <w:tc>
+          <w:tcPr>
+            <w:tcW w:type="dxa" w:w="1984"/>
+            <w:shd w:val="clear" w:color="auto" w:fill="F8F8F8"/>
+          </w:tcPr>
+          <w:p>
+            <w:r>
+              <w:rPr>
+                <w:sz w:val="15"/>
+              </w:rPr>
+              <w:t>เพิ่มสินค้าใหม่</w:t>
+              <w:br/>
+              <w:t>/resell/inventory/new</w:t>
+            </w:r>
+          </w:p>
+        </w:tc>
+        <w:tc>
+          <w:tcPr>
+            <w:tcW w:type="dxa" w:w="1701"/>
+            <w:shd w:val="clear" w:color="auto" w:fill="F8F8F8"/>
+          </w:tcPr>
+          <w:p>
+            <w:r>
+              <w:rPr>
+                <w:sz w:val="15"/>
+              </w:rPr>
+              <w:t>R-67 /resell/inventory</w:t>
+            </w:r>
+          </w:p>
+        </w:tc>
+        <w:tc>
+          <w:tcPr>
+            <w:tcW w:type="dxa" w:w="1984"/>
+            <w:shd w:val="clear" w:color="auto" w:fill="F8F8F8"/>
+          </w:tcPr>
+          <w:p>
+            <w:r>
+              <w:rPr>
+                <w:sz w:val="15"/>
+              </w:rPr>
+              <w:t>เพิ่มสินค้ามือสองใหม่เข้าคลัง</w:t>
+            </w:r>
+          </w:p>
+        </w:tc>
+        <w:tc>
+          <w:tcPr>
+            <w:tcW w:type="dxa" w:w="1701"/>
+            <w:shd w:val="clear" w:color="auto" w:fill="F8F8F8"/>
+          </w:tcPr>
+          <w:p>
+            <w:r>
+              <w:rPr>
+                <w:sz w:val="15"/>
+              </w:rPr>
+              <w:t>R-67 (บันทึกสำเร็จ)</w:t>
+            </w:r>
+          </w:p>
+        </w:tc>
+        <w:tc>
+          <w:tcPr>
+            <w:tcW w:type="dxa" w:w="1814"/>
+            <w:shd w:val="clear" w:color="auto" w:fill="F8F8F8"/>
+          </w:tcPr>
+          <w:p>
+            <w:r>
+              <w:rPr>
+                <w:sz w:val="15"/>
+              </w:rPr>
+              <w:t>—</w:t>
+            </w:r>
+          </w:p>
+        </w:tc>
+        <w:tc>
+          <w:tcPr>
+            <w:tcW w:type="dxa" w:w="907"/>
+            <w:shd w:val="clear" w:color="auto" w:fill="F8F8F8"/>
+          </w:tcPr>
+          <w:p>
+            <w:r>
+              <w:rPr>
+                <w:sz w:val="15"/>
+              </w:rPr>
+              <w:t>นอก chain</w:t>
+            </w:r>
+          </w:p>
+        </w:tc>
+        <w:tc>
+          <w:tcPr>
+            <w:tcW w:type="dxa" w:w="1701"/>
+            <w:shd w:val="clear" w:color="auto" w:fill="F8F8F8"/>
+          </w:tcPr>
+          <w:p>
+            <w:r>
+              <w:rPr>
+                <w:sz w:val="15"/>
+              </w:rPr>
+              <w:t>Form เพิ่มสินค้า</w:t>
+            </w:r>
+          </w:p>
+        </w:tc>
+        <w:tc>
+          <w:tcPr>
+            <w:tcW w:type="dxa" w:w="1984"/>
+            <w:shd w:val="clear" w:color="auto" w:fill="F8F8F8"/>
+          </w:tcPr>
+          <w:p>
+            <w:r>
+              <w:rPr>
+                <w:sz w:val="15"/>
+              </w:rPr>
+              <w:t>http://localhost:3001/resell/inventory/new</w:t>
+            </w:r>
+          </w:p>
+        </w:tc>
+      </w:tr>
+      <w:tr>
+        <w:tc>
+          <w:tcPr>
+            <w:tcW w:type="dxa" w:w="1247"/>
+            <w:shd w:val="clear" w:color="auto" w:fill="FFFFFF"/>
+          </w:tcPr>
+          <w:p>
+            <w:r>
+              <w:rPr>
+                <w:b/>
+                <w:color w:val="1A3A5C"/>
+                <w:sz w:val="15"/>
+              </w:rPr>
+              <w:t>R-67c</w:t>
+            </w:r>
+          </w:p>
+        </w:tc>
+        <w:tc>
+          <w:tcPr>
+            <w:tcW w:type="dxa" w:w="1984"/>
+            <w:shd w:val="clear" w:color="auto" w:fill="FFFFFF"/>
+          </w:tcPr>
+          <w:p>
+            <w:r>
+              <w:rPr>
+                <w:sz w:val="15"/>
+              </w:rPr>
+              <w:t>รายละเอียดสินค้า</w:t>
+              <w:br/>
+              <w:t>/resell/inventory/[id]</w:t>
+            </w:r>
+          </w:p>
+        </w:tc>
+        <w:tc>
+          <w:tcPr>
+            <w:tcW w:type="dxa" w:w="1701"/>
+            <w:shd w:val="clear" w:color="auto" w:fill="FFFFFF"/>
+          </w:tcPr>
+          <w:p>
+            <w:r>
+              <w:rPr>
+                <w:sz w:val="15"/>
+              </w:rPr>
+              <w:t>R-67 /resell/inventory</w:t>
+            </w:r>
+          </w:p>
+        </w:tc>
+        <w:tc>
+          <w:tcPr>
+            <w:tcW w:type="dxa" w:w="1984"/>
+            <w:shd w:val="clear" w:color="auto" w:fill="FFFFFF"/>
+          </w:tcPr>
+          <w:p>
+            <w:r>
+              <w:rPr>
+                <w:sz w:val="15"/>
+              </w:rPr>
+              <w:t>ดู/แก้ไขรายละเอียดสินค้าในคลัง</w:t>
+            </w:r>
+          </w:p>
+        </w:tc>
+        <w:tc>
+          <w:tcPr>
+            <w:tcW w:type="dxa" w:w="1701"/>
+            <w:shd w:val="clear" w:color="auto" w:fill="FFFFFF"/>
+          </w:tcPr>
+          <w:p>
+            <w:r>
+              <w:rPr>
+                <w:sz w:val="15"/>
+              </w:rPr>
+              <w:t>R-67 / R-15 (ลงประกาศ)</w:t>
+            </w:r>
+          </w:p>
+        </w:tc>
+        <w:tc>
+          <w:tcPr>
+            <w:tcW w:type="dxa" w:w="1814"/>
+            <w:shd w:val="clear" w:color="auto" w:fill="FFFFFF"/>
+          </w:tcPr>
+          <w:p>
+            <w:r>
+              <w:rPr>
+                <w:sz w:val="15"/>
+              </w:rPr>
+              <w:t>—</w:t>
+            </w:r>
+          </w:p>
+        </w:tc>
+        <w:tc>
+          <w:tcPr>
+            <w:tcW w:type="dxa" w:w="907"/>
+            <w:shd w:val="clear" w:color="auto" w:fill="FFFFFF"/>
+          </w:tcPr>
+          <w:p>
+            <w:r>
+              <w:rPr>
+                <w:sz w:val="15"/>
+              </w:rPr>
+              <w:t>นอก chain</w:t>
+            </w:r>
+          </w:p>
+        </w:tc>
+        <w:tc>
+          <w:tcPr>
+            <w:tcW w:type="dxa" w:w="1701"/>
+            <w:shd w:val="clear" w:color="auto" w:fill="FFFFFF"/>
+          </w:tcPr>
+          <w:p>
+            <w:r>
+              <w:rPr>
+                <w:sz w:val="15"/>
+              </w:rPr>
+              <w:t>Detail + edit inline</w:t>
+            </w:r>
+          </w:p>
+        </w:tc>
+        <w:tc>
+          <w:tcPr>
+            <w:tcW w:type="dxa" w:w="1984"/>
+            <w:shd w:val="clear" w:color="auto" w:fill="FFFFFF"/>
+          </w:tcPr>
+          <w:p>
+            <w:r>
+              <w:rPr>
+                <w:sz w:val="15"/>
+              </w:rPr>
+              <w:t>http://localhost:3001/resell/inventory/r001</w:t>
+            </w:r>
+          </w:p>
+        </w:tc>
+      </w:tr>
+      <w:tr>
+        <w:tc>
+          <w:tcPr>
+            <w:tcW w:type="dxa" w:w="1247"/>
+            <w:shd w:val="clear" w:color="auto" w:fill="F8F8F8"/>
+          </w:tcPr>
+          <w:p>
+            <w:r>
+              <w:rPr>
+                <w:b/>
+                <w:color w:val="1A3A5C"/>
+                <w:sz w:val="15"/>
+              </w:rPr>
+              <w:t>R-15</w:t>
+            </w:r>
+          </w:p>
+        </w:tc>
+        <w:tc>
+          <w:tcPr>
+            <w:tcW w:type="dxa" w:w="1984"/>
+            <w:shd w:val="clear" w:color="auto" w:fill="F8F8F8"/>
+          </w:tcPr>
+          <w:p>
+            <w:r>
+              <w:rPr>
+                <w:sz w:val="15"/>
+              </w:rPr>
+              <w:t>ประกาศของฉัน (WeeeR)</w:t>
+              <w:br/>
+              <w:t>/resell/listings</w:t>
+            </w:r>
+          </w:p>
+        </w:tc>
+        <w:tc>
+          <w:tcPr>
+            <w:tcW w:type="dxa" w:w="1701"/>
+            <w:shd w:val="clear" w:color="auto" w:fill="F8F8F8"/>
+          </w:tcPr>
+          <w:p>
+            <w:r>
+              <w:rPr>
+                <w:sz w:val="15"/>
+              </w:rPr>
+              <w:t>R-66 /resell</w:t>
+              <w:br/>
+              <w:t>R-01 /dashboard</w:t>
+            </w:r>
+          </w:p>
+        </w:tc>
+        <w:tc>
+          <w:tcPr>
+            <w:tcW w:type="dxa" w:w="1984"/>
+            <w:shd w:val="clear" w:color="auto" w:fill="F8F8F8"/>
+          </w:tcPr>
+          <w:p>
+            <w:r>
+              <w:rPr>
+                <w:sz w:val="15"/>
+              </w:rPr>
+              <w:t>รายการประกาศ resell ทั้งหมด</w:t>
+              <w:br/>
+              <w:t>Filter: status/date</w:t>
+            </w:r>
+          </w:p>
+        </w:tc>
+        <w:tc>
+          <w:tcPr>
+            <w:tcW w:type="dxa" w:w="1701"/>
+            <w:shd w:val="clear" w:color="auto" w:fill="F8F8F8"/>
+          </w:tcPr>
+          <w:p>
+            <w:r>
+              <w:rPr>
+                <w:sz w:val="15"/>
+              </w:rPr>
+              <w:t>R-16 /resell/listings/[id]</w:t>
+              <w:br/>
+              <w:t>⬜ /resell/listings/new</w:t>
+            </w:r>
+          </w:p>
+        </w:tc>
+        <w:tc>
+          <w:tcPr>
+            <w:tcW w:type="dxa" w:w="1814"/>
+            <w:shd w:val="clear" w:color="auto" w:fill="F8F8F8"/>
+          </w:tcPr>
+          <w:p>
+            <w:r>
+              <w:rPr>
+                <w:sz w:val="15"/>
+              </w:rPr>
+              <w:t>—</w:t>
+            </w:r>
+          </w:p>
+        </w:tc>
+        <w:tc>
+          <w:tcPr>
+            <w:tcW w:type="dxa" w:w="907"/>
+            <w:shd w:val="clear" w:color="auto" w:fill="F8F8F8"/>
+          </w:tcPr>
+          <w:p>
+            <w:r>
+              <w:rPr>
+                <w:sz w:val="15"/>
+              </w:rPr>
+              <w:t>นอก chain</w:t>
+            </w:r>
+          </w:p>
+        </w:tc>
+        <w:tc>
+          <w:tcPr>
+            <w:tcW w:type="dxa" w:w="1701"/>
+            <w:shd w:val="clear" w:color="auto" w:fill="F8F8F8"/>
+          </w:tcPr>
+          <w:p>
+            <w:r>
+              <w:rPr>
+                <w:sz w:val="15"/>
+              </w:rPr>
+              <w:t>P5 case-code ใน heading</w:t>
+              <w:br/>
+              <w:t>(PT-Audit gap)</w:t>
+            </w:r>
+          </w:p>
+        </w:tc>
+        <w:tc>
+          <w:tcPr>
+            <w:tcW w:type="dxa" w:w="1984"/>
+            <w:shd w:val="clear" w:color="auto" w:fill="F8F8F8"/>
+          </w:tcPr>
+          <w:p>
+            <w:r>
+              <w:rPr>
+                <w:sz w:val="15"/>
+              </w:rPr>
+              <w:t>http://localhost:3001/resell/listings</w:t>
+            </w:r>
+          </w:p>
+        </w:tc>
+      </w:tr>
+      <w:tr>
+        <w:tc>
+          <w:tcPr>
+            <w:tcW w:type="dxa" w:w="1247"/>
+            <w:shd w:val="clear" w:color="auto" w:fill="FCE4EC"/>
+          </w:tcPr>
+          <w:p>
+            <w:r>
+              <w:rPr>
+                <w:b/>
+                <w:color w:val="1A3A5C"/>
+                <w:sz w:val="15"/>
+              </w:rPr>
+              <w:t>R-16</w:t>
+            </w:r>
+          </w:p>
+        </w:tc>
+        <w:tc>
+          <w:tcPr>
+            <w:tcW w:type="dxa" w:w="1984"/>
+            <w:shd w:val="clear" w:color="auto" w:fill="FCE4EC"/>
+          </w:tcPr>
+          <w:p>
+            <w:r>
+              <w:rPr>
+                <w:sz w:val="15"/>
+              </w:rPr>
+              <w:t>รายละเอียดประกาศ R5</w:t>
+              <w:br/>
+              <w:t>/resell/listings/[id]</w:t>
+            </w:r>
+          </w:p>
+        </w:tc>
+        <w:tc>
+          <w:tcPr>
+            <w:tcW w:type="dxa" w:w="1701"/>
+            <w:shd w:val="clear" w:color="auto" w:fill="FCE4EC"/>
+          </w:tcPr>
+          <w:p>
+            <w:r>
+              <w:rPr>
+                <w:sz w:val="15"/>
+              </w:rPr>
+              <w:t>R-15 /resell/listings</w:t>
+            </w:r>
+          </w:p>
+        </w:tc>
+        <w:tc>
+          <w:tcPr>
+            <w:tcW w:type="dxa" w:w="1984"/>
+            <w:shd w:val="clear" w:color="auto" w:fill="FCE4EC"/>
+          </w:tcPr>
+          <w:p>
+            <w:r>
+              <w:rPr>
+                <w:sz w:val="15"/>
+              </w:rPr>
+              <w:t>R5: seller WeeeR ดูประกาศ</w:t>
+              <w:br/>
+              <w:t>withdraw selected offer</w:t>
+            </w:r>
+          </w:p>
+        </w:tc>
+        <w:tc>
+          <w:tcPr>
+            <w:tcW w:type="dxa" w:w="1701"/>
+            <w:shd w:val="clear" w:color="auto" w:fill="FCE4EC"/>
+          </w:tcPr>
+          <w:p>
+            <w:r>
+              <w:rPr>
+                <w:sz w:val="15"/>
+              </w:rPr>
+              <w:t>R-15 /resell/listings</w:t>
+            </w:r>
+          </w:p>
+        </w:tc>
+        <w:tc>
+          <w:tcPr>
+            <w:tcW w:type="dxa" w:w="1814"/>
+            <w:shd w:val="clear" w:color="auto" w:fill="FCE4EC"/>
+          </w:tcPr>
+          <w:p>
+            <w:r>
+              <w:rPr>
+                <w:sz w:val="15"/>
+              </w:rPr>
+              <w:t>WeeeU :3002 U-47c</w:t>
+            </w:r>
+          </w:p>
+        </w:tc>
+        <w:tc>
+          <w:tcPr>
+            <w:tcW w:type="dxa" w:w="907"/>
+            <w:shd w:val="clear" w:color="auto" w:fill="FCE4EC"/>
+          </w:tcPr>
+          <w:p>
+            <w:r>
+              <w:rPr>
+                <w:sz w:val="15"/>
+              </w:rPr>
+              <w:t>R5</w:t>
+            </w:r>
+          </w:p>
+        </w:tc>
+        <w:tc>
+          <w:tcPr>
+            <w:tcW w:type="dxa" w:w="1701"/>
+            <w:shd w:val="clear" w:color="auto" w:fill="FCE4EC"/>
+          </w:tcPr>
+          <w:p>
+            <w:r>
+              <w:rPr>
+                <w:sz w:val="15"/>
+              </w:rPr>
+              <w:t>P2 case-code ใน heading</w:t>
+              <w:br/>
+              <w:t>(PT-Audit gap)</w:t>
+            </w:r>
+          </w:p>
+        </w:tc>
+        <w:tc>
+          <w:tcPr>
+            <w:tcW w:type="dxa" w:w="1984"/>
+            <w:shd w:val="clear" w:color="auto" w:fill="FCE4EC"/>
+          </w:tcPr>
+          <w:p>
+            <w:r>
+              <w:rPr>
+                <w:sz w:val="15"/>
+              </w:rPr>
+              <w:t>http://localhost:3001/resell/listings/r001</w:t>
+            </w:r>
+          </w:p>
+        </w:tc>
+      </w:tr>
+      <w:tr>
+        <w:tc>
+          <w:tcPr>
+            <w:tcW w:type="dxa" w:w="1247"/>
+            <w:shd w:val="clear" w:color="auto" w:fill="EDF7ED"/>
+          </w:tcPr>
+          <w:p>
+            <w:r>
+              <w:rPr>
+                <w:b/>
+                <w:color w:val="1A3A5C"/>
+                <w:sz w:val="15"/>
+              </w:rPr>
+              <w:t>R-41</w:t>
+            </w:r>
+          </w:p>
+        </w:tc>
+        <w:tc>
+          <w:tcPr>
+            <w:tcW w:type="dxa" w:w="1984"/>
+            <w:shd w:val="clear" w:color="auto" w:fill="EDF7ED"/>
+          </w:tcPr>
+          <w:p>
+            <w:r>
+              <w:rPr>
+                <w:sz w:val="15"/>
+              </w:rPr>
+              <w:t>ลงประกาศสำเร็จ</w:t>
+              <w:br/>
+              <w:t>/resell/listings/new/success</w:t>
+            </w:r>
+          </w:p>
+        </w:tc>
+        <w:tc>
+          <w:tcPr>
+            <w:tcW w:type="dxa" w:w="1701"/>
+            <w:shd w:val="clear" w:color="auto" w:fill="EDF7ED"/>
+          </w:tcPr>
+          <w:p>
+            <w:r>
+              <w:rPr>
+                <w:sz w:val="15"/>
+              </w:rPr>
+              <w:t>⬜ /resell/listings/new</w:t>
+            </w:r>
+          </w:p>
+        </w:tc>
+        <w:tc>
+          <w:tcPr>
+            <w:tcW w:type="dxa" w:w="1984"/>
+            <w:shd w:val="clear" w:color="auto" w:fill="EDF7ED"/>
+          </w:tcPr>
+          <w:p>
+            <w:r>
+              <w:rPr>
+                <w:sz w:val="15"/>
+              </w:rPr>
+              <w:t>R1: WeeeR seller ลงประกาศ</w:t>
+              <w:br/>
+              <w:t>resell คู่ขนาน WeeeU seller</w:t>
+            </w:r>
+          </w:p>
+        </w:tc>
+        <w:tc>
+          <w:tcPr>
+            <w:tcW w:type="dxa" w:w="1701"/>
+            <w:shd w:val="clear" w:color="auto" w:fill="EDF7ED"/>
+          </w:tcPr>
+          <w:p>
+            <w:r>
+              <w:rPr>
+                <w:sz w:val="15"/>
+              </w:rPr>
+              <w:t>R-15 /resell/listings</w:t>
+            </w:r>
+          </w:p>
+        </w:tc>
+        <w:tc>
+          <w:tcPr>
+            <w:tcW w:type="dxa" w:w="1814"/>
+            <w:shd w:val="clear" w:color="auto" w:fill="EDF7ED"/>
+          </w:tcPr>
+          <w:p>
+            <w:r>
+              <w:rPr>
+                <w:sz w:val="15"/>
+              </w:rPr>
+              <w:t>WeeeU :3002 U-21 (marketplace)</w:t>
+            </w:r>
+          </w:p>
+        </w:tc>
+        <w:tc>
+          <w:tcPr>
+            <w:tcW w:type="dxa" w:w="907"/>
+            <w:shd w:val="clear" w:color="auto" w:fill="EDF7ED"/>
+          </w:tcPr>
+          <w:p>
+            <w:r>
+              <w:rPr>
+                <w:sz w:val="15"/>
+              </w:rPr>
+              <w:t>R1</w:t>
+            </w:r>
+          </w:p>
+        </w:tc>
+        <w:tc>
+          <w:tcPr>
+            <w:tcW w:type="dxa" w:w="1701"/>
+            <w:shd w:val="clear" w:color="auto" w:fill="EDF7ED"/>
+          </w:tcPr>
+          <w:p>
+            <w:r>
+              <w:rPr>
+                <w:sz w:val="15"/>
+              </w:rPr>
+              <w:t>R-41 in-chain R1</w:t>
+            </w:r>
+          </w:p>
+        </w:tc>
+        <w:tc>
+          <w:tcPr>
+            <w:tcW w:type="dxa" w:w="1984"/>
+            <w:shd w:val="clear" w:color="auto" w:fill="EDF7ED"/>
+          </w:tcPr>
+          <w:p>
+            <w:r>
+              <w:rPr>
+                <w:sz w:val="15"/>
+              </w:rPr>
+              <w:t>http://localhost:3001/resell/listings/new/success</w:t>
+            </w:r>
+          </w:p>
+        </w:tc>
+      </w:tr>
+      <w:tr>
+        <w:tc>
+          <w:tcPr>
+            <w:tcW w:type="dxa" w:w="1247"/>
+            <w:shd w:val="clear" w:color="auto" w:fill="FFF3CD"/>
+          </w:tcPr>
+          <w:p>
+            <w:r>
+              <w:rPr>
+                <w:b/>
+                <w:color w:val="1A3A5C"/>
+                <w:sz w:val="15"/>
+              </w:rPr>
+              <w:t>R-15c</w:t>
+            </w:r>
+          </w:p>
+        </w:tc>
+        <w:tc>
+          <w:tcPr>
+            <w:tcW w:type="dxa" w:w="1984"/>
+            <w:shd w:val="clear" w:color="auto" w:fill="FFF3CD"/>
+          </w:tcPr>
+          <w:p>
+            <w:r>
+              <w:rPr>
+                <w:sz w:val="15"/>
+              </w:rPr>
+              <w:t>รับซื้อมือสอง B6</w:t>
+              <w:br/>
+              <w:t>/resell/buy</w:t>
+            </w:r>
+          </w:p>
+        </w:tc>
+        <w:tc>
+          <w:tcPr>
+            <w:tcW w:type="dxa" w:w="1701"/>
+            <w:shd w:val="clear" w:color="auto" w:fill="FFF3CD"/>
+          </w:tcPr>
+          <w:p>
+            <w:r>
+              <w:rPr>
+                <w:sz w:val="15"/>
+              </w:rPr>
+              <w:t>R-66 /resell</w:t>
+            </w:r>
+          </w:p>
+        </w:tc>
+        <w:tc>
+          <w:tcPr>
+            <w:tcW w:type="dxa" w:w="1984"/>
+            <w:shd w:val="clear" w:color="auto" w:fill="FFF3CD"/>
+          </w:tcPr>
+          <w:p>
+            <w:r>
+              <w:rPr>
+                <w:sz w:val="15"/>
+              </w:rPr>
+              <w:t>B6: ร้านรับซื้อมือสอง</w:t>
+              <w:br/>
+              <w:t>ประเมินราคาเบื้องต้น</w:t>
+            </w:r>
+          </w:p>
+        </w:tc>
+        <w:tc>
+          <w:tcPr>
+            <w:tcW w:type="dxa" w:w="1701"/>
+            <w:shd w:val="clear" w:color="auto" w:fill="FFF3CD"/>
+          </w:tcPr>
+          <w:p>
+            <w:r>
+              <w:rPr>
+                <w:sz w:val="15"/>
+              </w:rPr>
+              <w:t>R-15b /resell/buy/wizard</w:t>
+            </w:r>
+          </w:p>
+        </w:tc>
+        <w:tc>
+          <w:tcPr>
+            <w:tcW w:type="dxa" w:w="1814"/>
+            <w:shd w:val="clear" w:color="auto" w:fill="FFF3CD"/>
+          </w:tcPr>
+          <w:p>
+            <w:r>
+              <w:rPr>
+                <w:sz w:val="15"/>
+              </w:rPr>
+              <w:t>—</w:t>
+            </w:r>
+          </w:p>
+        </w:tc>
+        <w:tc>
+          <w:tcPr>
+            <w:tcW w:type="dxa" w:w="907"/>
+            <w:shd w:val="clear" w:color="auto" w:fill="FFF3CD"/>
+          </w:tcPr>
+          <w:p>
+            <w:r>
+              <w:rPr>
+                <w:sz w:val="15"/>
+              </w:rPr>
+              <w:t>B6</w:t>
+            </w:r>
+          </w:p>
+        </w:tc>
+        <w:tc>
+          <w:tcPr>
+            <w:tcW w:type="dxa" w:w="1701"/>
+            <w:shd w:val="clear" w:color="auto" w:fill="FFF3CD"/>
+          </w:tcPr>
+          <w:p>
+            <w:r>
+              <w:rPr>
+                <w:sz w:val="15"/>
+              </w:rPr>
+              <w:t>case-code (B6) ใน heading</w:t>
+              <w:br/>
+              <w:t>(PT-Audit gap)</w:t>
+            </w:r>
+          </w:p>
+        </w:tc>
+        <w:tc>
+          <w:tcPr>
+            <w:tcW w:type="dxa" w:w="1984"/>
+            <w:shd w:val="clear" w:color="auto" w:fill="FFF3CD"/>
+          </w:tcPr>
+          <w:p>
+            <w:r>
+              <w:rPr>
+                <w:sz w:val="15"/>
+              </w:rPr>
+              <w:t>http://localhost:3001/resell/buy</w:t>
+            </w:r>
+          </w:p>
+        </w:tc>
+      </w:tr>
+      <w:tr>
+        <w:tc>
+          <w:tcPr>
+            <w:tcW w:type="dxa" w:w="1247"/>
+            <w:shd w:val="clear" w:color="auto" w:fill="FFF3CD"/>
+          </w:tcPr>
+          <w:p>
+            <w:r>
+              <w:rPr>
+                <w:b/>
+                <w:color w:val="1A3A5C"/>
+                <w:sz w:val="15"/>
+              </w:rPr>
+              <w:t>R-15b</w:t>
+            </w:r>
+          </w:p>
+        </w:tc>
+        <w:tc>
+          <w:tcPr>
+            <w:tcW w:type="dxa" w:w="1984"/>
+            <w:shd w:val="clear" w:color="auto" w:fill="FFF3CD"/>
+          </w:tcPr>
+          <w:p>
+            <w:r>
+              <w:rPr>
+                <w:sz w:val="15"/>
+              </w:rPr>
+              <w:t>ประเมินราคา B6 Wizard</w:t>
+              <w:br/>
+              <w:t>/resell/buy/wizard</w:t>
+            </w:r>
+          </w:p>
+        </w:tc>
+        <w:tc>
+          <w:tcPr>
+            <w:tcW w:type="dxa" w:w="1701"/>
+            <w:shd w:val="clear" w:color="auto" w:fill="FFF3CD"/>
+          </w:tcPr>
+          <w:p>
+            <w:r>
+              <w:rPr>
+                <w:sz w:val="15"/>
+              </w:rPr>
+              <w:t>R-15c /resell/buy</w:t>
+            </w:r>
+          </w:p>
+        </w:tc>
+        <w:tc>
+          <w:tcPr>
+            <w:tcW w:type="dxa" w:w="1984"/>
+            <w:shd w:val="clear" w:color="auto" w:fill="FFF3CD"/>
+          </w:tcPr>
+          <w:p>
+            <w:r>
+              <w:rPr>
+                <w:sz w:val="15"/>
+              </w:rPr>
+              <w:t>B6: Wizard ประเมินราคา</w:t>
+              <w:br/>
+              <w:t>ก่อนรับซื้อ</w:t>
+            </w:r>
+          </w:p>
+        </w:tc>
+        <w:tc>
+          <w:tcPr>
+            <w:tcW w:type="dxa" w:w="1701"/>
+            <w:shd w:val="clear" w:color="auto" w:fill="FFF3CD"/>
+          </w:tcPr>
+          <w:p>
+            <w:r>
+              <w:rPr>
+                <w:sz w:val="15"/>
+              </w:rPr>
+              <w:t>R-15 (บันทึก + listing)</w:t>
+            </w:r>
+          </w:p>
+        </w:tc>
+        <w:tc>
+          <w:tcPr>
+            <w:tcW w:type="dxa" w:w="1814"/>
+            <w:shd w:val="clear" w:color="auto" w:fill="FFF3CD"/>
+          </w:tcPr>
+          <w:p>
+            <w:r>
+              <w:rPr>
+                <w:sz w:val="15"/>
+              </w:rPr>
+              <w:t>—</w:t>
+            </w:r>
+          </w:p>
+        </w:tc>
+        <w:tc>
+          <w:tcPr>
+            <w:tcW w:type="dxa" w:w="907"/>
+            <w:shd w:val="clear" w:color="auto" w:fill="FFF3CD"/>
+          </w:tcPr>
+          <w:p>
+            <w:r>
+              <w:rPr>
+                <w:sz w:val="15"/>
+              </w:rPr>
+              <w:t>B6</w:t>
+            </w:r>
+          </w:p>
+        </w:tc>
+        <w:tc>
+          <w:tcPr>
+            <w:tcW w:type="dxa" w:w="1701"/>
+            <w:shd w:val="clear" w:color="auto" w:fill="FFF3CD"/>
+          </w:tcPr>
+          <w:p>
+            <w:r>
+              <w:rPr>
+                <w:sz w:val="15"/>
+              </w:rPr>
+              <w:t>Multi-step wizard</w:t>
+              <w:br/>
+              <w:t>photo + condition</w:t>
+            </w:r>
+          </w:p>
+        </w:tc>
+        <w:tc>
+          <w:tcPr>
+            <w:tcW w:type="dxa" w:w="1984"/>
+            <w:shd w:val="clear" w:color="auto" w:fill="FFF3CD"/>
+          </w:tcPr>
+          <w:p>
+            <w:r>
+              <w:rPr>
+                <w:sz w:val="15"/>
+              </w:rPr>
+              <w:t>http://localhost:3001/resell/buy/wizard</w:t>
+            </w:r>
+          </w:p>
+        </w:tc>
+      </w:tr>
+      <w:tr>
+        <w:tc>
+          <w:tcPr>
+            <w:tcW w:type="dxa" w:w="1247"/>
+            <w:shd w:val="clear" w:color="auto" w:fill="E3F2FD"/>
+          </w:tcPr>
+          <w:p>
+            <w:r>
+              <w:rPr>
+                <w:b/>
+                <w:color w:val="1A3A5C"/>
+                <w:sz w:val="15"/>
+              </w:rPr>
+              <w:t>R-17</w:t>
+            </w:r>
+          </w:p>
+        </w:tc>
+        <w:tc>
+          <w:tcPr>
+            <w:tcW w:type="dxa" w:w="1984"/>
+            <w:shd w:val="clear" w:color="auto" w:fill="E3F2FD"/>
+          </w:tcPr>
+          <w:p>
+            <w:r>
+              <w:rPr>
+                <w:sz w:val="15"/>
+              </w:rPr>
+              <w:t>Marketplace C2C</w:t>
+              <w:br/>
+              <w:t>/resell/marketplace</w:t>
+            </w:r>
+          </w:p>
+        </w:tc>
+        <w:tc>
+          <w:tcPr>
+            <w:tcW w:type="dxa" w:w="1701"/>
+            <w:shd w:val="clear" w:color="auto" w:fill="E3F2FD"/>
+          </w:tcPr>
+          <w:p>
+            <w:r>
+              <w:rPr>
+                <w:sz w:val="15"/>
+              </w:rPr>
+              <w:t>R-66 /resell</w:t>
+            </w:r>
+          </w:p>
+        </w:tc>
+        <w:tc>
+          <w:tcPr>
+            <w:tcW w:type="dxa" w:w="1984"/>
+            <w:shd w:val="clear" w:color="auto" w:fill="E3F2FD"/>
+          </w:tcPr>
+          <w:p>
+            <w:r>
+              <w:rPr>
+                <w:sz w:val="15"/>
+              </w:rPr>
+              <w:t>R3: ร้าน WeeeR เรียกดู</w:t>
+              <w:br/>
+              <w:t>marketplace C2C ของ WeeeU</w:t>
+            </w:r>
+          </w:p>
+        </w:tc>
+        <w:tc>
+          <w:tcPr>
+            <w:tcW w:type="dxa" w:w="1701"/>
+            <w:shd w:val="clear" w:color="auto" w:fill="E3F2FD"/>
+          </w:tcPr>
+          <w:p>
+            <w:r>
+              <w:rPr>
+                <w:sz w:val="15"/>
+              </w:rPr>
+              <w:t>R-19 /resell/marketplace/[id]</w:t>
+            </w:r>
+          </w:p>
+        </w:tc>
+        <w:tc>
+          <w:tcPr>
+            <w:tcW w:type="dxa" w:w="1814"/>
+            <w:shd w:val="clear" w:color="auto" w:fill="E3F2FD"/>
+          </w:tcPr>
+          <w:p>
+            <w:r>
+              <w:rPr>
+                <w:sz w:val="15"/>
+              </w:rPr>
+              <w:t>WeeeU :3002 U-21 (canonical)</w:t>
+            </w:r>
+          </w:p>
+        </w:tc>
+        <w:tc>
+          <w:tcPr>
+            <w:tcW w:type="dxa" w:w="907"/>
+            <w:shd w:val="clear" w:color="auto" w:fill="E3F2FD"/>
+          </w:tcPr>
+          <w:p>
+            <w:r>
+              <w:rPr>
+                <w:sz w:val="15"/>
+              </w:rPr>
+              <w:t>R3</w:t>
+            </w:r>
+          </w:p>
+        </w:tc>
+        <w:tc>
+          <w:tcPr>
+            <w:tcW w:type="dxa" w:w="1701"/>
+            <w:shd w:val="clear" w:color="auto" w:fill="E3F2FD"/>
+          </w:tcPr>
+          <w:p>
+            <w:r>
+              <w:rPr>
+                <w:sz w:val="15"/>
+              </w:rPr>
+              <w:t>WeeeR buyer view</w:t>
+            </w:r>
+          </w:p>
+        </w:tc>
+        <w:tc>
+          <w:tcPr>
+            <w:tcW w:type="dxa" w:w="1984"/>
+            <w:shd w:val="clear" w:color="auto" w:fill="E3F2FD"/>
+          </w:tcPr>
+          <w:p>
+            <w:r>
+              <w:rPr>
+                <w:sz w:val="15"/>
+              </w:rPr>
+              <w:t>http://localhost:3001/resell/marketplace</w:t>
+            </w:r>
+          </w:p>
+        </w:tc>
+      </w:tr>
+      <w:tr>
+        <w:tc>
+          <w:tcPr>
+            <w:tcW w:type="dxa" w:w="1247"/>
+            <w:shd w:val="clear" w:color="auto" w:fill="E3F2FD"/>
+          </w:tcPr>
+          <w:p>
+            <w:r>
+              <w:rPr>
+                <w:b/>
+                <w:color w:val="1A3A5C"/>
+                <w:sz w:val="15"/>
+              </w:rPr>
+              <w:t>R-19</w:t>
+            </w:r>
+          </w:p>
+        </w:tc>
+        <w:tc>
+          <w:tcPr>
+            <w:tcW w:type="dxa" w:w="1984"/>
+            <w:shd w:val="clear" w:color="auto" w:fill="E3F2FD"/>
+          </w:tcPr>
+          <w:p>
+            <w:r>
+              <w:rPr>
+                <w:sz w:val="15"/>
+              </w:rPr>
+              <w:t>รายละเอียดสินค้า C2C</w:t>
+              <w:br/>
+              <w:t>/resell/marketplace/[id]</w:t>
+            </w:r>
+          </w:p>
+        </w:tc>
+        <w:tc>
+          <w:tcPr>
+            <w:tcW w:type="dxa" w:w="1701"/>
+            <w:shd w:val="clear" w:color="auto" w:fill="E3F2FD"/>
+          </w:tcPr>
+          <w:p>
+            <w:r>
+              <w:rPr>
+                <w:sz w:val="15"/>
+              </w:rPr>
+              <w:t>R-17 /resell/marketplace</w:t>
+            </w:r>
+          </w:p>
+        </w:tc>
+        <w:tc>
+          <w:tcPr>
+            <w:tcW w:type="dxa" w:w="1984"/>
+            <w:shd w:val="clear" w:color="auto" w:fill="E3F2FD"/>
+          </w:tcPr>
+          <w:p>
+            <w:r>
+              <w:rPr>
+                <w:sz w:val="15"/>
+              </w:rPr>
+              <w:t>R3: ร้านดูรายละเอียด</w:t>
+              <w:br/>
+              <w:t>ก่อนยื่นข้อเสนอ</w:t>
+            </w:r>
+          </w:p>
+        </w:tc>
+        <w:tc>
+          <w:tcPr>
+            <w:tcW w:type="dxa" w:w="1701"/>
+            <w:shd w:val="clear" w:color="auto" w:fill="E3F2FD"/>
+          </w:tcPr>
+          <w:p>
+            <w:r>
+              <w:rPr>
+                <w:sz w:val="15"/>
+              </w:rPr>
+              <w:t>R-18 /resell/marketplace/[id]/offer</w:t>
+            </w:r>
+          </w:p>
+        </w:tc>
+        <w:tc>
+          <w:tcPr>
+            <w:tcW w:type="dxa" w:w="1814"/>
+            <w:shd w:val="clear" w:color="auto" w:fill="E3F2FD"/>
+          </w:tcPr>
+          <w:p>
+            <w:r>
+              <w:rPr>
+                <w:sz w:val="15"/>
+              </w:rPr>
+              <w:t>WeeeU :3002 U-23</w:t>
+            </w:r>
+          </w:p>
+        </w:tc>
+        <w:tc>
+          <w:tcPr>
+            <w:tcW w:type="dxa" w:w="907"/>
+            <w:shd w:val="clear" w:color="auto" w:fill="E3F2FD"/>
+          </w:tcPr>
+          <w:p>
+            <w:r>
+              <w:rPr>
+                <w:sz w:val="15"/>
+              </w:rPr>
+              <w:t>R3</w:t>
+            </w:r>
+          </w:p>
+        </w:tc>
+        <w:tc>
+          <w:tcPr>
+            <w:tcW w:type="dxa" w:w="1701"/>
+            <w:shd w:val="clear" w:color="auto" w:fill="E3F2FD"/>
+          </w:tcPr>
+          <w:p>
+            <w:r>
+              <w:rPr>
+                <w:sz w:val="15"/>
+              </w:rPr>
+              <w:t>WeeeR buyer detail</w:t>
+            </w:r>
+          </w:p>
+        </w:tc>
+        <w:tc>
+          <w:tcPr>
+            <w:tcW w:type="dxa" w:w="1984"/>
+            <w:shd w:val="clear" w:color="auto" w:fill="E3F2FD"/>
+          </w:tcPr>
+          <w:p>
+            <w:r>
+              <w:rPr>
+                <w:sz w:val="15"/>
+              </w:rPr>
+              <w:t>http://localhost:3001/resell/marketplace/r001</w:t>
+            </w:r>
+          </w:p>
+        </w:tc>
+      </w:tr>
+      <w:tr>
+        <w:tc>
+          <w:tcPr>
+            <w:tcW w:type="dxa" w:w="1247"/>
+            <w:shd w:val="clear" w:color="auto" w:fill="E3F2FD"/>
+          </w:tcPr>
+          <w:p>
+            <w:r>
+              <w:rPr>
+                <w:b/>
+                <w:color w:val="1A3A5C"/>
+                <w:sz w:val="15"/>
+              </w:rPr>
+              <w:t>R-18</w:t>
+            </w:r>
+          </w:p>
+        </w:tc>
+        <w:tc>
+          <w:tcPr>
+            <w:tcW w:type="dxa" w:w="1984"/>
+            <w:shd w:val="clear" w:color="auto" w:fill="E3F2FD"/>
+          </w:tcPr>
+          <w:p>
+            <w:r>
+              <w:rPr>
+                <w:sz w:val="15"/>
+              </w:rPr>
+              <w:t>ส่งข้อเสนอ C2C</w:t>
+              <w:br/>
+              <w:t>/resell/marketplace/[id]/offer</w:t>
+            </w:r>
+          </w:p>
+        </w:tc>
+        <w:tc>
+          <w:tcPr>
+            <w:tcW w:type="dxa" w:w="1701"/>
+            <w:shd w:val="clear" w:color="auto" w:fill="E3F2FD"/>
+          </w:tcPr>
+          <w:p>
+            <w:r>
+              <w:rPr>
+                <w:sz w:val="15"/>
+              </w:rPr>
+              <w:t>R-19 /resell/marketplace/[id]</w:t>
+            </w:r>
+          </w:p>
+        </w:tc>
+        <w:tc>
+          <w:tcPr>
+            <w:tcW w:type="dxa" w:w="1984"/>
+            <w:shd w:val="clear" w:color="auto" w:fill="E3F2FD"/>
+          </w:tcPr>
+          <w:p>
+            <w:r>
+              <w:rPr>
+                <w:sz w:val="15"/>
+              </w:rPr>
+              <w:t>R3: ร้านยื่นข้อเสนอซื้อ</w:t>
+              <w:br/>
+              <w:t>offer = SoT</w:t>
+            </w:r>
+          </w:p>
+        </w:tc>
+        <w:tc>
+          <w:tcPr>
+            <w:tcW w:type="dxa" w:w="1701"/>
+            <w:shd w:val="clear" w:color="auto" w:fill="E3F2FD"/>
+          </w:tcPr>
+          <w:p>
+            <w:r>
+              <w:rPr>
+                <w:sz w:val="15"/>
+              </w:rPr>
+              <w:t>R-20 /resell/purchases</w:t>
+            </w:r>
+          </w:p>
+        </w:tc>
+        <w:tc>
+          <w:tcPr>
+            <w:tcW w:type="dxa" w:w="1814"/>
+            <w:shd w:val="clear" w:color="auto" w:fill="E3F2FD"/>
+          </w:tcPr>
+          <w:p>
+            <w:r>
+              <w:rPr>
+                <w:sz w:val="15"/>
+              </w:rPr>
+              <w:t>WeeeU :3002 U-22</w:t>
+              <w:br/>
+              <w:t>offer SoT · seller เห็น +1</w:t>
+            </w:r>
+          </w:p>
+        </w:tc>
+        <w:tc>
+          <w:tcPr>
+            <w:tcW w:type="dxa" w:w="907"/>
+            <w:shd w:val="clear" w:color="auto" w:fill="E3F2FD"/>
+          </w:tcPr>
+          <w:p>
+            <w:r>
+              <w:rPr>
+                <w:sz w:val="15"/>
+              </w:rPr>
+              <w:t>R3</w:t>
+            </w:r>
+          </w:p>
+        </w:tc>
+        <w:tc>
+          <w:tcPr>
+            <w:tcW w:type="dxa" w:w="1701"/>
+            <w:shd w:val="clear" w:color="auto" w:fill="E3F2FD"/>
+          </w:tcPr>
+          <w:p>
+            <w:r>
+              <w:rPr>
+                <w:sz w:val="15"/>
+              </w:rPr>
+              <w:t>offer = Source of Truth</w:t>
+            </w:r>
+          </w:p>
+        </w:tc>
+        <w:tc>
+          <w:tcPr>
+            <w:tcW w:type="dxa" w:w="1984"/>
+            <w:shd w:val="clear" w:color="auto" w:fill="E3F2FD"/>
+          </w:tcPr>
+          <w:p>
+            <w:r>
+              <w:rPr>
+                <w:sz w:val="15"/>
+              </w:rPr>
+              <w:t>http://localhost:3001/resell/marketplace/r001/offer</w:t>
+            </w:r>
+          </w:p>
+        </w:tc>
+      </w:tr>
+      <w:tr>
+        <w:tc>
+          <w:tcPr>
+            <w:tcW w:type="dxa" w:w="1247"/>
+            <w:shd w:val="clear" w:color="auto" w:fill="F8F8F8"/>
+          </w:tcPr>
+          <w:p>
+            <w:r>
+              <w:rPr>
+                <w:b/>
+                <w:color w:val="1A3A5C"/>
+                <w:sz w:val="15"/>
+              </w:rPr>
+              <w:t>R-20</w:t>
+            </w:r>
+          </w:p>
+        </w:tc>
+        <w:tc>
+          <w:tcPr>
+            <w:tcW w:type="dxa" w:w="1984"/>
+            <w:shd w:val="clear" w:color="auto" w:fill="F8F8F8"/>
+          </w:tcPr>
+          <w:p>
+            <w:r>
+              <w:rPr>
+                <w:sz w:val="15"/>
+              </w:rPr>
+              <w:t>การซื้อ C2C</w:t>
+              <w:br/>
+              <w:t>/resell/purchases</w:t>
+            </w:r>
+          </w:p>
+        </w:tc>
+        <w:tc>
+          <w:tcPr>
+            <w:tcW w:type="dxa" w:w="1701"/>
+            <w:shd w:val="clear" w:color="auto" w:fill="F8F8F8"/>
+          </w:tcPr>
+          <w:p>
+            <w:r>
+              <w:rPr>
+                <w:sz w:val="15"/>
+              </w:rPr>
+              <w:t>R-66 /resell</w:t>
+            </w:r>
+          </w:p>
+        </w:tc>
+        <w:tc>
+          <w:tcPr>
+            <w:tcW w:type="dxa" w:w="1984"/>
+            <w:shd w:val="clear" w:color="auto" w:fill="F8F8F8"/>
+          </w:tcPr>
+          <w:p>
+            <w:r>
+              <w:rPr>
+                <w:sz w:val="15"/>
+              </w:rPr>
+              <w:t>รายการซื้อ C2C ทั้งหมดของร้าน</w:t>
+            </w:r>
+          </w:p>
+        </w:tc>
+        <w:tc>
+          <w:tcPr>
+            <w:tcW w:type="dxa" w:w="1701"/>
+            <w:shd w:val="clear" w:color="auto" w:fill="F8F8F8"/>
+          </w:tcPr>
+          <w:p>
+            <w:r>
+              <w:rPr>
+                <w:sz w:val="15"/>
+              </w:rPr>
+              <w:t>R-23 /resell/purchases/[id]</w:t>
+            </w:r>
+          </w:p>
+        </w:tc>
+        <w:tc>
+          <w:tcPr>
+            <w:tcW w:type="dxa" w:w="1814"/>
+            <w:shd w:val="clear" w:color="auto" w:fill="F8F8F8"/>
+          </w:tcPr>
+          <w:p>
+            <w:r>
+              <w:rPr>
+                <w:sz w:val="15"/>
+              </w:rPr>
+              <w:t>—</w:t>
+            </w:r>
+          </w:p>
+        </w:tc>
+        <w:tc>
+          <w:tcPr>
+            <w:tcW w:type="dxa" w:w="907"/>
+            <w:shd w:val="clear" w:color="auto" w:fill="F8F8F8"/>
+          </w:tcPr>
+          <w:p>
+            <w:r>
+              <w:rPr>
+                <w:sz w:val="15"/>
+              </w:rPr>
+              <w:t>นอก chain</w:t>
+            </w:r>
+          </w:p>
+        </w:tc>
+        <w:tc>
+          <w:tcPr>
+            <w:tcW w:type="dxa" w:w="1701"/>
+            <w:shd w:val="clear" w:color="auto" w:fill="F8F8F8"/>
+          </w:tcPr>
+          <w:p>
+            <w:r>
+              <w:rPr>
+                <w:sz w:val="15"/>
+              </w:rPr>
+              <w:t>Purchase list overview</w:t>
+            </w:r>
+          </w:p>
+        </w:tc>
+        <w:tc>
+          <w:tcPr>
+            <w:tcW w:type="dxa" w:w="1984"/>
+            <w:shd w:val="clear" w:color="auto" w:fill="F8F8F8"/>
+          </w:tcPr>
+          <w:p>
+            <w:r>
+              <w:rPr>
+                <w:sz w:val="15"/>
+              </w:rPr>
+              <w:t>http://localhost:3001/resell/purchases</w:t>
+            </w:r>
+          </w:p>
+        </w:tc>
+      </w:tr>
+      <w:tr>
+        <w:tc>
+          <w:tcPr>
+            <w:tcW w:type="dxa" w:w="1247"/>
+            <w:shd w:val="clear" w:color="auto" w:fill="E8F5E9"/>
+          </w:tcPr>
+          <w:p>
+            <w:r>
+              <w:rPr>
+                <w:b/>
+                <w:color w:val="1A3A5C"/>
+                <w:sz w:val="15"/>
+              </w:rPr>
+              <w:t>R-23</w:t>
+            </w:r>
+          </w:p>
+        </w:tc>
+        <w:tc>
+          <w:tcPr>
+            <w:tcW w:type="dxa" w:w="1984"/>
+            <w:shd w:val="clear" w:color="auto" w:fill="E8F5E9"/>
+          </w:tcPr>
+          <w:p>
+            <w:r>
+              <w:rPr>
+                <w:sz w:val="15"/>
+              </w:rPr>
+              <w:t>รายละเอียดการซื้อ</w:t>
+              <w:br/>
+              <w:t>/resell/purchases/[id]</w:t>
+            </w:r>
+          </w:p>
+        </w:tc>
+        <w:tc>
+          <w:tcPr>
+            <w:tcW w:type="dxa" w:w="1701"/>
+            <w:shd w:val="clear" w:color="auto" w:fill="E8F5E9"/>
+          </w:tcPr>
+          <w:p>
+            <w:r>
+              <w:rPr>
+                <w:sz w:val="15"/>
+              </w:rPr>
+              <w:t>R-20 /resell/purchases</w:t>
+            </w:r>
+          </w:p>
+        </w:tc>
+        <w:tc>
+          <w:tcPr>
+            <w:tcW w:type="dxa" w:w="1984"/>
+            <w:shd w:val="clear" w:color="auto" w:fill="E8F5E9"/>
+          </w:tcPr>
+          <w:p>
+            <w:r>
+              <w:rPr>
+                <w:sz w:val="15"/>
+              </w:rPr>
+              <w:t>R7: ร้าน WeeeR เป็นผู้ซื้อ</w:t>
+              <w:br/>
+              <w:t>ติดตาม order จาก WeeeU</w:t>
+            </w:r>
+          </w:p>
+        </w:tc>
+        <w:tc>
+          <w:tcPr>
+            <w:tcW w:type="dxa" w:w="1701"/>
+            <w:shd w:val="clear" w:color="auto" w:fill="E8F5E9"/>
+          </w:tcPr>
+          <w:p>
+            <w:r>
+              <w:rPr>
+                <w:sz w:val="15"/>
+              </w:rPr>
+              <w:t>R-21 /resell/purchases/[id]/inspect</w:t>
+            </w:r>
+          </w:p>
+        </w:tc>
+        <w:tc>
+          <w:tcPr>
+            <w:tcW w:type="dxa" w:w="1814"/>
+            <w:shd w:val="clear" w:color="auto" w:fill="E8F5E9"/>
+          </w:tcPr>
+          <w:p>
+            <w:r>
+              <w:rPr>
+                <w:sz w:val="15"/>
+              </w:rPr>
+              <w:t>WeeeU :3002 U-19c</w:t>
+            </w:r>
+          </w:p>
+        </w:tc>
+        <w:tc>
+          <w:tcPr>
+            <w:tcW w:type="dxa" w:w="907"/>
+            <w:shd w:val="clear" w:color="auto" w:fill="E8F5E9"/>
+          </w:tcPr>
+          <w:p>
+            <w:r>
+              <w:rPr>
+                <w:sz w:val="15"/>
+              </w:rPr>
+              <w:t>R7</w:t>
+            </w:r>
+          </w:p>
+        </w:tc>
+        <w:tc>
+          <w:tcPr>
+            <w:tcW w:type="dxa" w:w="1701"/>
+            <w:shd w:val="clear" w:color="auto" w:fill="E8F5E9"/>
+          </w:tcPr>
+          <w:p>
+            <w:r>
+              <w:rPr>
+                <w:sz w:val="15"/>
+              </w:rPr>
+              <w:t>WeeeR ในบทบาทผู้ซื้อ</w:t>
+            </w:r>
+          </w:p>
+        </w:tc>
+        <w:tc>
+          <w:tcPr>
+            <w:tcW w:type="dxa" w:w="1984"/>
+            <w:shd w:val="clear" w:color="auto" w:fill="E8F5E9"/>
+          </w:tcPr>
+          <w:p>
+            <w:r>
+              <w:rPr>
+                <w:sz w:val="15"/>
+              </w:rPr>
+              <w:t>http://localhost:3001/resell/purchases/o001</w:t>
+            </w:r>
+          </w:p>
+        </w:tc>
+      </w:tr>
+      <w:tr>
+        <w:tc>
+          <w:tcPr>
+            <w:tcW w:type="dxa" w:w="1247"/>
+            <w:shd w:val="clear" w:color="auto" w:fill="EDF7ED"/>
+          </w:tcPr>
+          <w:p>
+            <w:r>
+              <w:rPr>
+                <w:b/>
+                <w:color w:val="1A3A5C"/>
+                <w:sz w:val="15"/>
+              </w:rPr>
+              <w:t>R-21</w:t>
+            </w:r>
+          </w:p>
+        </w:tc>
+        <w:tc>
+          <w:tcPr>
+            <w:tcW w:type="dxa" w:w="1984"/>
+            <w:shd w:val="clear" w:color="auto" w:fill="EDF7ED"/>
+          </w:tcPr>
+          <w:p>
+            <w:r>
+              <w:rPr>
+                <w:sz w:val="15"/>
+              </w:rPr>
+              <w:t>ตรวจรับสินค้า</w:t>
+              <w:br/>
+              <w:t>/resell/purchases/[id]/inspect</w:t>
+            </w:r>
+          </w:p>
+        </w:tc>
+        <w:tc>
+          <w:tcPr>
+            <w:tcW w:type="dxa" w:w="1701"/>
+            <w:shd w:val="clear" w:color="auto" w:fill="EDF7ED"/>
+          </w:tcPr>
+          <w:p>
+            <w:r>
+              <w:rPr>
+                <w:sz w:val="15"/>
+              </w:rPr>
+              <w:t>R-23 /resell/purchases/[id]</w:t>
+            </w:r>
+          </w:p>
+        </w:tc>
+        <w:tc>
+          <w:tcPr>
+            <w:tcW w:type="dxa" w:w="1984"/>
+            <w:shd w:val="clear" w:color="auto" w:fill="EDF7ED"/>
+          </w:tcPr>
+          <w:p>
+            <w:r>
+              <w:rPr>
+                <w:sz w:val="15"/>
+              </w:rPr>
+              <w:t>R1/R7: WeeeR ตรวจรับสินค้า</w:t>
+              <w:br/>
+              <w:t>จาก WeeeU seller</w:t>
+            </w:r>
+          </w:p>
+        </w:tc>
+        <w:tc>
+          <w:tcPr>
+            <w:tcW w:type="dxa" w:w="1701"/>
+            <w:shd w:val="clear" w:color="auto" w:fill="EDF7ED"/>
+          </w:tcPr>
+          <w:p>
+            <w:r>
+              <w:rPr>
+                <w:sz w:val="15"/>
+              </w:rPr>
+              <w:t>R-22 (reject) / R-23 (accept)</w:t>
+            </w:r>
+          </w:p>
+        </w:tc>
+        <w:tc>
+          <w:tcPr>
+            <w:tcW w:type="dxa" w:w="1814"/>
+            <w:shd w:val="clear" w:color="auto" w:fill="EDF7ED"/>
+          </w:tcPr>
+          <w:p>
+            <w:r>
+              <w:rPr>
+                <w:sz w:val="15"/>
+              </w:rPr>
+              <w:t>WeeeU :3002 U-24</w:t>
+            </w:r>
+          </w:p>
+        </w:tc>
+        <w:tc>
+          <w:tcPr>
+            <w:tcW w:type="dxa" w:w="907"/>
+            <w:shd w:val="clear" w:color="auto" w:fill="EDF7ED"/>
+          </w:tcPr>
+          <w:p>
+            <w:r>
+              <w:rPr>
+                <w:sz w:val="15"/>
+              </w:rPr>
+              <w:t>R1, R7</w:t>
+            </w:r>
+          </w:p>
+        </w:tc>
+        <w:tc>
+          <w:tcPr>
+            <w:tcW w:type="dxa" w:w="1701"/>
+            <w:shd w:val="clear" w:color="auto" w:fill="EDF7ED"/>
+          </w:tcPr>
+          <w:p>
+            <w:r>
+              <w:rPr>
+                <w:sz w:val="15"/>
+              </w:rPr>
+              <w:t>Inspection form + photo</w:t>
+            </w:r>
+          </w:p>
+        </w:tc>
+        <w:tc>
+          <w:tcPr>
+            <w:tcW w:type="dxa" w:w="1984"/>
+            <w:shd w:val="clear" w:color="auto" w:fill="EDF7ED"/>
+          </w:tcPr>
+          <w:p>
+            <w:r>
+              <w:rPr>
+                <w:sz w:val="15"/>
+              </w:rPr>
+              <w:t>http://localhost:3001/resell/purchases/o001/inspect</w:t>
+            </w:r>
+          </w:p>
+        </w:tc>
+      </w:tr>
+      <w:tr>
+        <w:tc>
+          <w:tcPr>
+            <w:tcW w:type="dxa" w:w="1247"/>
+            <w:shd w:val="clear" w:color="auto" w:fill="FFF9C4"/>
+          </w:tcPr>
+          <w:p>
+            <w:r>
+              <w:rPr>
+                <w:b/>
+                <w:color w:val="1A3A5C"/>
+                <w:sz w:val="15"/>
+              </w:rPr>
+              <w:t>R-22</w:t>
+            </w:r>
+          </w:p>
+        </w:tc>
+        <w:tc>
+          <w:tcPr>
+            <w:tcW w:type="dxa" w:w="1984"/>
+            <w:shd w:val="clear" w:color="auto" w:fill="FFF9C4"/>
+          </w:tcPr>
+          <w:p>
+            <w:r>
+              <w:rPr>
+                <w:sz w:val="15"/>
+              </w:rPr>
+              <w:t>ข้อพิพาท R8</w:t>
+              <w:br/>
+              <w:t>/resell/purchases/[id]/dispute</w:t>
+            </w:r>
+          </w:p>
+        </w:tc>
+        <w:tc>
+          <w:tcPr>
+            <w:tcW w:type="dxa" w:w="1701"/>
+            <w:shd w:val="clear" w:color="auto" w:fill="FFF9C4"/>
+          </w:tcPr>
+          <w:p>
+            <w:r>
+              <w:rPr>
+                <w:sz w:val="15"/>
+              </w:rPr>
+              <w:t>R-21 (ปฏิเสธ)</w:t>
+            </w:r>
+          </w:p>
+        </w:tc>
+        <w:tc>
+          <w:tcPr>
+            <w:tcW w:type="dxa" w:w="1984"/>
+            <w:shd w:val="clear" w:color="auto" w:fill="FFF9C4"/>
+          </w:tcPr>
+          <w:p>
+            <w:r>
+              <w:rPr>
+                <w:sz w:val="15"/>
+              </w:rPr>
+              <w:t>R8: ร้านยื่นข้อพิพาท</w:t>
+              <w:br/>
+              <w:t>offer = SoT</w:t>
+            </w:r>
+          </w:p>
+        </w:tc>
+        <w:tc>
+          <w:tcPr>
+            <w:tcW w:type="dxa" w:w="1701"/>
+            <w:shd w:val="clear" w:color="auto" w:fill="FFF9C4"/>
+          </w:tcPr>
+          <w:p>
+            <w:r>
+              <w:rPr>
+                <w:sz w:val="15"/>
+              </w:rPr>
+              <w:t>Admin :3000 A-13 (รอตัดสิน)</w:t>
+            </w:r>
+          </w:p>
+        </w:tc>
+        <w:tc>
+          <w:tcPr>
+            <w:tcW w:type="dxa" w:w="1814"/>
+            <w:shd w:val="clear" w:color="auto" w:fill="FFF9C4"/>
+          </w:tcPr>
+          <w:p>
+            <w:r>
+              <w:rPr>
+                <w:sz w:val="15"/>
+              </w:rPr>
+              <w:t>Admin :3000 A-13</w:t>
+              <w:br/>
+              <w:t>WeeeU :3002 U-26</w:t>
+            </w:r>
+          </w:p>
+        </w:tc>
+        <w:tc>
+          <w:tcPr>
+            <w:tcW w:type="dxa" w:w="907"/>
+            <w:shd w:val="clear" w:color="auto" w:fill="FFF9C4"/>
+          </w:tcPr>
+          <w:p>
+            <w:r>
+              <w:rPr>
+                <w:sz w:val="15"/>
+              </w:rPr>
+              <w:t>R8</w:t>
+            </w:r>
+          </w:p>
+        </w:tc>
+        <w:tc>
+          <w:tcPr>
+            <w:tcW w:type="dxa" w:w="1701"/>
+            <w:shd w:val="clear" w:color="auto" w:fill="FFF9C4"/>
+          </w:tcPr>
+          <w:p>
+            <w:r>
+              <w:rPr>
+                <w:sz w:val="15"/>
+              </w:rPr>
+              <w:t>offer = SoT</w:t>
+              <w:br/>
+              <w:t>Evidence upload</w:t>
+            </w:r>
+          </w:p>
+        </w:tc>
+        <w:tc>
+          <w:tcPr>
+            <w:tcW w:type="dxa" w:w="1984"/>
+            <w:shd w:val="clear" w:color="auto" w:fill="FFF9C4"/>
+          </w:tcPr>
+          <w:p>
+            <w:r>
+              <w:rPr>
+                <w:sz w:val="15"/>
+              </w:rPr>
+              <w:t>http://localhost:3001/resell/purchases/o001/dispute</w:t>
+            </w:r>
+          </w:p>
+        </w:tc>
+      </w:tr>
+      <w:tr>
+        <w:tc>
+          <w:tcPr>
+            <w:tcW w:type="dxa" w:w="1247"/>
+            <w:shd w:val="clear" w:color="auto" w:fill="F8F8F8"/>
+          </w:tcPr>
+          <w:p>
+            <w:r>
+              <w:rPr>
+                <w:b/>
+                <w:color w:val="1A3A5C"/>
+                <w:sz w:val="15"/>
+              </w:rPr>
+              <w:t>R-68</w:t>
+            </w:r>
+          </w:p>
+        </w:tc>
+        <w:tc>
+          <w:tcPr>
+            <w:tcW w:type="dxa" w:w="1984"/>
+            <w:shd w:val="clear" w:color="auto" w:fill="F8F8F8"/>
+          </w:tcPr>
+          <w:p>
+            <w:r>
+              <w:rPr>
+                <w:sz w:val="15"/>
+              </w:rPr>
+              <w:t>ข้อเสนอของฉัน</w:t>
+              <w:br/>
+              <w:t>/resell/offers</w:t>
+            </w:r>
+          </w:p>
+        </w:tc>
+        <w:tc>
+          <w:tcPr>
+            <w:tcW w:type="dxa" w:w="1701"/>
+            <w:shd w:val="clear" w:color="auto" w:fill="F8F8F8"/>
+          </w:tcPr>
+          <w:p>
+            <w:r>
+              <w:rPr>
+                <w:sz w:val="15"/>
+              </w:rPr>
+              <w:t>R-66 /resell</w:t>
+            </w:r>
+          </w:p>
+        </w:tc>
+        <w:tc>
+          <w:tcPr>
+            <w:tcW w:type="dxa" w:w="1984"/>
+            <w:shd w:val="clear" w:color="auto" w:fill="F8F8F8"/>
+          </w:tcPr>
+          <w:p>
+            <w:r>
+              <w:rPr>
+                <w:sz w:val="15"/>
+              </w:rPr>
+              <w:t>รายการ offer ที่ร้าน WeeeR</w:t>
+              <w:br/>
+              <w:t>ยื่นไปยัง WeeeU</w:t>
+            </w:r>
+          </w:p>
+        </w:tc>
+        <w:tc>
+          <w:tcPr>
+            <w:tcW w:type="dxa" w:w="1701"/>
+            <w:shd w:val="clear" w:color="auto" w:fill="F8F8F8"/>
+          </w:tcPr>
+          <w:p>
+            <w:r>
+              <w:rPr>
+                <w:sz w:val="15"/>
+              </w:rPr>
+              <w:t>R-19 (ดู listing ที่ offer)</w:t>
+            </w:r>
+          </w:p>
+        </w:tc>
+        <w:tc>
+          <w:tcPr>
+            <w:tcW w:type="dxa" w:w="1814"/>
+            <w:shd w:val="clear" w:color="auto" w:fill="F8F8F8"/>
+          </w:tcPr>
+          <w:p>
+            <w:r>
+              <w:rPr>
+                <w:sz w:val="15"/>
+              </w:rPr>
+              <w:t>WeeeU :3002 U-22 (canonical)</w:t>
+            </w:r>
+          </w:p>
+        </w:tc>
+        <w:tc>
+          <w:tcPr>
+            <w:tcW w:type="dxa" w:w="907"/>
+            <w:shd w:val="clear" w:color="auto" w:fill="F8F8F8"/>
+          </w:tcPr>
+          <w:p>
+            <w:r>
+              <w:rPr>
+                <w:sz w:val="15"/>
+              </w:rPr>
+              <w:t>นอก chain</w:t>
+            </w:r>
+          </w:p>
+        </w:tc>
+        <w:tc>
+          <w:tcPr>
+            <w:tcW w:type="dxa" w:w="1701"/>
+            <w:shd w:val="clear" w:color="auto" w:fill="F8F8F8"/>
+          </w:tcPr>
+          <w:p>
+            <w:r>
+              <w:rPr>
+                <w:sz w:val="15"/>
+              </w:rPr>
+              <w:t>Offer tracking list</w:t>
+            </w:r>
+          </w:p>
+        </w:tc>
+        <w:tc>
+          <w:tcPr>
+            <w:tcW w:type="dxa" w:w="1984"/>
+            <w:shd w:val="clear" w:color="auto" w:fill="F8F8F8"/>
+          </w:tcPr>
+          <w:p>
+            <w:r>
+              <w:rPr>
+                <w:sz w:val="15"/>
+              </w:rPr>
+              <w:t>http://localhost:3001/resell/offers</w:t>
+            </w:r>
+          </w:p>
+        </w:tc>
+      </w:tr>
+      <w:tr>
+        <w:tc>
+          <w:tcPr>
+            <w:tcW w:type="dxa" w:w="1247"/>
+            <w:shd w:val="clear" w:color="auto" w:fill="FFFFFF"/>
+          </w:tcPr>
+          <w:p>
+            <w:r>
+              <w:rPr>
+                <w:b/>
+                <w:color w:val="1A3A5C"/>
+                <w:sz w:val="15"/>
+              </w:rPr>
+              <w:t>R-69</w:t>
+            </w:r>
+          </w:p>
+        </w:tc>
+        <w:tc>
+          <w:tcPr>
+            <w:tcW w:type="dxa" w:w="1984"/>
+            <w:shd w:val="clear" w:color="auto" w:fill="FFFFFF"/>
+          </w:tcPr>
+          <w:p>
+            <w:r>
+              <w:rPr>
+                <w:sz w:val="15"/>
+              </w:rPr>
+              <w:t>รายการซื้อขาย</w:t>
+              <w:br/>
+              <w:t>/resell/transactions</w:t>
+            </w:r>
+          </w:p>
+        </w:tc>
+        <w:tc>
+          <w:tcPr>
+            <w:tcW w:type="dxa" w:w="1701"/>
+            <w:shd w:val="clear" w:color="auto" w:fill="FFFFFF"/>
+          </w:tcPr>
+          <w:p>
+            <w:r>
+              <w:rPr>
+                <w:sz w:val="15"/>
+              </w:rPr>
+              <w:t>R-66 /resell</w:t>
+            </w:r>
+          </w:p>
+        </w:tc>
+        <w:tc>
+          <w:tcPr>
+            <w:tcW w:type="dxa" w:w="1984"/>
+            <w:shd w:val="clear" w:color="auto" w:fill="FFFFFF"/>
+          </w:tcPr>
+          <w:p>
+            <w:r>
+              <w:rPr>
+                <w:sz w:val="15"/>
+              </w:rPr>
+              <w:t>รายการ transaction resell</w:t>
+              <w:br/>
+              <w:t>ทั้งหมด (seller + buyer)</w:t>
+            </w:r>
+          </w:p>
+        </w:tc>
+        <w:tc>
+          <w:tcPr>
+            <w:tcW w:type="dxa" w:w="1701"/>
+            <w:shd w:val="clear" w:color="auto" w:fill="FFFFFF"/>
+          </w:tcPr>
+          <w:p>
+            <w:r>
+              <w:rPr>
+                <w:sz w:val="15"/>
+              </w:rPr>
+              <w:t>R-69b /resell/transactions/[id]</w:t>
+            </w:r>
+          </w:p>
+        </w:tc>
+        <w:tc>
+          <w:tcPr>
+            <w:tcW w:type="dxa" w:w="1814"/>
+            <w:shd w:val="clear" w:color="auto" w:fill="FFFFFF"/>
+          </w:tcPr>
+          <w:p>
+            <w:r>
+              <w:rPr>
+                <w:sz w:val="15"/>
+              </w:rPr>
+              <w:t>—</w:t>
+            </w:r>
+          </w:p>
+        </w:tc>
+        <w:tc>
+          <w:tcPr>
+            <w:tcW w:type="dxa" w:w="907"/>
+            <w:shd w:val="clear" w:color="auto" w:fill="FFFFFF"/>
+          </w:tcPr>
+          <w:p>
+            <w:r>
+              <w:rPr>
+                <w:sz w:val="15"/>
+              </w:rPr>
+              <w:t>นอก chain</w:t>
+            </w:r>
+          </w:p>
+        </w:tc>
+        <w:tc>
+          <w:tcPr>
+            <w:tcW w:type="dxa" w:w="1701"/>
+            <w:shd w:val="clear" w:color="auto" w:fill="FFFFFF"/>
+          </w:tcPr>
+          <w:p>
+            <w:r>
+              <w:rPr>
+                <w:sz w:val="15"/>
+              </w:rPr>
+              <w:t>Transaction hub list</w:t>
+            </w:r>
+          </w:p>
+        </w:tc>
+        <w:tc>
+          <w:tcPr>
+            <w:tcW w:type="dxa" w:w="1984"/>
+            <w:shd w:val="clear" w:color="auto" w:fill="FFFFFF"/>
+          </w:tcPr>
+          <w:p>
+            <w:r>
+              <w:rPr>
+                <w:sz w:val="15"/>
+              </w:rPr>
+              <w:t>http://localhost:3001/resell/transactions</w:t>
+            </w:r>
+          </w:p>
+        </w:tc>
+      </w:tr>
+      <w:tr>
+        <w:tc>
+          <w:tcPr>
+            <w:tcW w:type="dxa" w:w="1247"/>
+            <w:shd w:val="clear" w:color="auto" w:fill="FFF8E1"/>
+          </w:tcPr>
+          <w:p>
+            <w:r>
+              <w:rPr>
+                <w:b/>
+                <w:color w:val="1A3A5C"/>
+                <w:sz w:val="15"/>
+              </w:rPr>
+              <w:t>R-69b</w:t>
+            </w:r>
+          </w:p>
+        </w:tc>
+        <w:tc>
+          <w:tcPr>
+            <w:tcW w:type="dxa" w:w="1984"/>
+            <w:shd w:val="clear" w:color="auto" w:fill="FFF8E1"/>
+          </w:tcPr>
+          <w:p>
+            <w:r>
+              <w:rPr>
+                <w:sz w:val="15"/>
+              </w:rPr>
+              <w:t>รายละเอียดซื้อขาย</w:t>
+              <w:br/>
+              <w:t>/resell/transactions/[id]</w:t>
+            </w:r>
+          </w:p>
+        </w:tc>
+        <w:tc>
+          <w:tcPr>
+            <w:tcW w:type="dxa" w:w="1701"/>
+            <w:shd w:val="clear" w:color="auto" w:fill="FFF8E1"/>
+          </w:tcPr>
+          <w:p>
+            <w:r>
+              <w:rPr>
+                <w:sz w:val="15"/>
+              </w:rPr>
+              <w:t>R-69 /resell/transactions</w:t>
+            </w:r>
+          </w:p>
+        </w:tc>
+        <w:tc>
+          <w:tcPr>
+            <w:tcW w:type="dxa" w:w="1984"/>
+            <w:shd w:val="clear" w:color="auto" w:fill="FFF8E1"/>
+          </w:tcPr>
+          <w:p>
+            <w:r>
+              <w:rPr>
+                <w:sz w:val="15"/>
+              </w:rPr>
+              <w:t>R4: seller เห็น transaction</w:t>
+              <w:br/>
+              <w:t>ที่รอ buyer ชำระ</w:t>
+            </w:r>
+          </w:p>
+        </w:tc>
+        <w:tc>
+          <w:tcPr>
+            <w:tcW w:type="dxa" w:w="1701"/>
+            <w:shd w:val="clear" w:color="auto" w:fill="FFF8E1"/>
+          </w:tcPr>
+          <w:p>
+            <w:r>
+              <w:rPr>
+                <w:sz w:val="15"/>
+              </w:rPr>
+              <w:t>R-69 (กลับ)</w:t>
+            </w:r>
+          </w:p>
+        </w:tc>
+        <w:tc>
+          <w:tcPr>
+            <w:tcW w:type="dxa" w:w="1814"/>
+            <w:shd w:val="clear" w:color="auto" w:fill="FFF8E1"/>
+          </w:tcPr>
+          <w:p>
+            <w:r>
+              <w:rPr>
+                <w:sz w:val="15"/>
+              </w:rPr>
+              <w:t>WeeeU :3002 U-19b (Escrow)</w:t>
+            </w:r>
+          </w:p>
+        </w:tc>
+        <w:tc>
+          <w:tcPr>
+            <w:tcW w:type="dxa" w:w="907"/>
+            <w:shd w:val="clear" w:color="auto" w:fill="FFF8E1"/>
+          </w:tcPr>
+          <w:p>
+            <w:r>
+              <w:rPr>
+                <w:sz w:val="15"/>
+              </w:rPr>
+              <w:t>R4</w:t>
+            </w:r>
+          </w:p>
+        </w:tc>
+        <w:tc>
+          <w:tcPr>
+            <w:tcW w:type="dxa" w:w="1701"/>
+            <w:shd w:val="clear" w:color="auto" w:fill="FFF8E1"/>
+          </w:tcPr>
+          <w:p>
+            <w:r>
+              <w:rPr>
+                <w:sz w:val="15"/>
+              </w:rPr>
+              <w:t>bare 'Dispute' ใน heading:300</w:t>
+              <w:br/>
+              <w:t>→ 'ข้อพิพาท (Dispute)'</w:t>
+              <w:br/>
+              <w:t>(PT-Audit gap)</w:t>
+            </w:r>
+          </w:p>
+        </w:tc>
+        <w:tc>
+          <w:tcPr>
+            <w:tcW w:type="dxa" w:w="1984"/>
+            <w:shd w:val="clear" w:color="auto" w:fill="FFF8E1"/>
+          </w:tcPr>
+          <w:p>
+            <w:r>
+              <w:rPr>
+                <w:sz w:val="15"/>
+              </w:rPr>
+              <w:t>http://localhost:3001/resell/transactions/o001</w:t>
+            </w:r>
+          </w:p>
+        </w:tc>
+      </w:tr>
+      <w:tr>
+        <w:tc>
+          <w:tcPr>
+            <w:tcW w:type="dxa" w:w="1247"/>
+            <w:shd w:val="clear" w:color="auto" w:fill="4A148C"/>
+          </w:tcPr>
+          <w:p>
+            <w:r>
+              <w:rPr>
+                <w:b/>
+                <w:color w:val="FFFFFF"/>
+                <w:sz w:val="17"/>
+              </w:rPr>
+              <w:t>🟣 Admin (localhost:3000) — 10 จอ · Dispute + Audit + Analytics</w:t>
+            </w:r>
+          </w:p>
+        </w:tc>
+        <w:tc>
+          <w:tcPr>
+            <w:tcW w:type="dxa" w:w="1984"/>
+            <w:shd w:val="clear" w:color="auto" w:fill="4A148C"/>
+          </w:tcPr>
+          <w:p/>
+        </w:tc>
+        <w:tc>
+          <w:tcPr>
+            <w:tcW w:type="dxa" w:w="1701"/>
+            <w:shd w:val="clear" w:color="auto" w:fill="4A148C"/>
+          </w:tcPr>
+          <w:p/>
+        </w:tc>
+        <w:tc>
+          <w:tcPr>
+            <w:tcW w:type="dxa" w:w="1984"/>
+            <w:shd w:val="clear" w:color="auto" w:fill="4A148C"/>
+          </w:tcPr>
+          <w:p/>
+        </w:tc>
+        <w:tc>
+          <w:tcPr>
+            <w:tcW w:type="dxa" w:w="1701"/>
+            <w:shd w:val="clear" w:color="auto" w:fill="4A148C"/>
+          </w:tcPr>
+          <w:p/>
+        </w:tc>
+        <w:tc>
+          <w:tcPr>
+            <w:tcW w:type="dxa" w:w="1814"/>
+            <w:shd w:val="clear" w:color="auto" w:fill="4A148C"/>
+          </w:tcPr>
+          <w:p/>
+        </w:tc>
+        <w:tc>
+          <w:tcPr>
+            <w:tcW w:type="dxa" w:w="907"/>
+            <w:shd w:val="clear" w:color="auto" w:fill="4A148C"/>
+          </w:tcPr>
+          <w:p/>
+        </w:tc>
+        <w:tc>
+          <w:tcPr>
+            <w:tcW w:type="dxa" w:w="1701"/>
+            <w:shd w:val="clear" w:color="auto" w:fill="4A148C"/>
+          </w:tcPr>
+          <w:p/>
+        </w:tc>
+        <w:tc>
+          <w:tcPr>
+            <w:tcW w:type="dxa" w:w="1984"/>
+            <w:shd w:val="clear" w:color="auto" w:fill="4A148C"/>
+          </w:tcPr>
+          <w:p/>
+        </w:tc>
+      </w:tr>
+      <w:tr>
+        <w:tc>
+          <w:tcPr>
+            <w:tcW w:type="dxa" w:w="1247"/>
+            <w:shd w:val="clear" w:color="auto" w:fill="EDF7ED"/>
+          </w:tcPr>
+          <w:p>
+            <w:r>
+              <w:rPr>
+                <w:b/>
+                <w:color w:val="1A3A5C"/>
+                <w:sz w:val="15"/>
+              </w:rPr>
+              <w:t>A-12</w:t>
+            </w:r>
+          </w:p>
+        </w:tc>
+        <w:tc>
+          <w:tcPr>
+            <w:tcW w:type="dxa" w:w="1984"/>
+            <w:shd w:val="clear" w:color="auto" w:fill="EDF7ED"/>
+          </w:tcPr>
+          <w:p>
+            <w:r>
+              <w:rPr>
+                <w:sz w:val="15"/>
+              </w:rPr>
+              <w:t>ตรวจ listings (Admin)</w:t>
+              <w:br/>
+              <w:t>/resell/listings</w:t>
+            </w:r>
+          </w:p>
+        </w:tc>
+        <w:tc>
+          <w:tcPr>
+            <w:tcW w:type="dxa" w:w="1701"/>
+            <w:shd w:val="clear" w:color="auto" w:fill="EDF7ED"/>
+          </w:tcPr>
+          <w:p>
+            <w:r>
+              <w:rPr>
+                <w:sz w:val="15"/>
+              </w:rPr>
+              <w:t>A-01 /dashboard</w:t>
+            </w:r>
+          </w:p>
+        </w:tc>
+        <w:tc>
+          <w:tcPr>
+            <w:tcW w:type="dxa" w:w="1984"/>
+            <w:shd w:val="clear" w:color="auto" w:fill="EDF7ED"/>
+          </w:tcPr>
+          <w:p>
+            <w:r>
+              <w:rPr>
+                <w:sz w:val="15"/>
+              </w:rPr>
+              <w:t>R1: Admin เฝ้าดูประกาศใหม่</w:t>
+              <w:br/>
+              <w:t>รอตรวจสอบ approve/reject</w:t>
+            </w:r>
+          </w:p>
+        </w:tc>
+        <w:tc>
+          <w:tcPr>
+            <w:tcW w:type="dxa" w:w="1701"/>
+            <w:shd w:val="clear" w:color="auto" w:fill="EDF7ED"/>
+          </w:tcPr>
+          <w:p>
+            <w:r>
+              <w:rPr>
+                <w:sz w:val="15"/>
+              </w:rPr>
+              <w:t>A-12b /resell/listings/[id]</w:t>
+            </w:r>
+          </w:p>
+        </w:tc>
+        <w:tc>
+          <w:tcPr>
+            <w:tcW w:type="dxa" w:w="1814"/>
+            <w:shd w:val="clear" w:color="auto" w:fill="EDF7ED"/>
+          </w:tcPr>
+          <w:p>
+            <w:r>
+              <w:rPr>
+                <w:sz w:val="15"/>
+              </w:rPr>
+              <w:t>WeeeU :3002 U-47a</w:t>
+              <w:br/>
+              <w:t>WeeeR :3001 R-41</w:t>
+            </w:r>
+          </w:p>
+        </w:tc>
+        <w:tc>
+          <w:tcPr>
+            <w:tcW w:type="dxa" w:w="907"/>
+            <w:shd w:val="clear" w:color="auto" w:fill="EDF7ED"/>
+          </w:tcPr>
+          <w:p>
+            <w:r>
+              <w:rPr>
+                <w:sz w:val="15"/>
+              </w:rPr>
+              <w:t>R1</w:t>
+            </w:r>
+          </w:p>
+        </w:tc>
+        <w:tc>
+          <w:tcPr>
+            <w:tcW w:type="dxa" w:w="1701"/>
+            <w:shd w:val="clear" w:color="auto" w:fill="EDF7ED"/>
+          </w:tcPr>
+          <w:p>
+            <w:r>
+              <w:rPr>
+                <w:sz w:val="15"/>
+              </w:rPr>
+              <w:t>Admin approve listing</w:t>
+            </w:r>
+          </w:p>
+        </w:tc>
+        <w:tc>
+          <w:tcPr>
+            <w:tcW w:type="dxa" w:w="1984"/>
+            <w:shd w:val="clear" w:color="auto" w:fill="EDF7ED"/>
+          </w:tcPr>
+          <w:p>
+            <w:r>
+              <w:rPr>
+                <w:sz w:val="15"/>
+              </w:rPr>
+              <w:t>http://localhost:3000/resell/listings</w:t>
+            </w:r>
+          </w:p>
+        </w:tc>
+      </w:tr>
+      <w:tr>
+        <w:tc>
+          <w:tcPr>
+            <w:tcW w:type="dxa" w:w="1247"/>
+            <w:shd w:val="clear" w:color="auto" w:fill="EDF7ED"/>
+          </w:tcPr>
+          <w:p>
+            <w:r>
+              <w:rPr>
+                <w:b/>
+                <w:color w:val="1A3A5C"/>
+                <w:sz w:val="15"/>
+              </w:rPr>
+              <w:t>A-12b</w:t>
+            </w:r>
+          </w:p>
+        </w:tc>
+        <w:tc>
+          <w:tcPr>
+            <w:tcW w:type="dxa" w:w="1984"/>
+            <w:shd w:val="clear" w:color="auto" w:fill="EDF7ED"/>
+          </w:tcPr>
+          <w:p>
+            <w:r>
+              <w:rPr>
+                <w:sz w:val="15"/>
+              </w:rPr>
+              <w:t>รายละเอียดประกาศ (Admin)</w:t>
+              <w:br/>
+              <w:t>/resell/listings/[id]</w:t>
+            </w:r>
+          </w:p>
+        </w:tc>
+        <w:tc>
+          <w:tcPr>
+            <w:tcW w:type="dxa" w:w="1701"/>
+            <w:shd w:val="clear" w:color="auto" w:fill="EDF7ED"/>
+          </w:tcPr>
+          <w:p>
+            <w:r>
+              <w:rPr>
+                <w:sz w:val="15"/>
+              </w:rPr>
+              <w:t>A-12 /resell/listings</w:t>
+            </w:r>
+          </w:p>
+        </w:tc>
+        <w:tc>
+          <w:tcPr>
+            <w:tcW w:type="dxa" w:w="1984"/>
+            <w:shd w:val="clear" w:color="auto" w:fill="EDF7ED"/>
+          </w:tcPr>
+          <w:p>
+            <w:r>
+              <w:rPr>
+                <w:sz w:val="15"/>
+              </w:rPr>
+              <w:t>R2: Admin เห็น suspension + appeal</w:t>
+              <w:br/>
+              <w:t>Approve/Reject/Suspend actions</w:t>
+            </w:r>
+          </w:p>
+        </w:tc>
+        <w:tc>
+          <w:tcPr>
+            <w:tcW w:type="dxa" w:w="1701"/>
+            <w:shd w:val="clear" w:color="auto" w:fill="EDF7ED"/>
+          </w:tcPr>
+          <w:p>
+            <w:r>
+              <w:rPr>
+                <w:sz w:val="15"/>
+              </w:rPr>
+              <w:t>A-12 (หลัง action)</w:t>
+            </w:r>
+          </w:p>
+        </w:tc>
+        <w:tc>
+          <w:tcPr>
+            <w:tcW w:type="dxa" w:w="1814"/>
+            <w:shd w:val="clear" w:color="auto" w:fill="EDF7ED"/>
+          </w:tcPr>
+          <w:p>
+            <w:r>
+              <w:rPr>
+                <w:sz w:val="15"/>
+              </w:rPr>
+              <w:t>WeeeU :3002 U-47c</w:t>
+              <w:br/>
+              <w:t>seller เห็น appeal result</w:t>
+            </w:r>
+          </w:p>
+        </w:tc>
+        <w:tc>
+          <w:tcPr>
+            <w:tcW w:type="dxa" w:w="907"/>
+            <w:shd w:val="clear" w:color="auto" w:fill="EDF7ED"/>
+          </w:tcPr>
+          <w:p>
+            <w:r>
+              <w:rPr>
+                <w:sz w:val="15"/>
+              </w:rPr>
+              <w:t>R1, R2</w:t>
+            </w:r>
+          </w:p>
+        </w:tc>
+        <w:tc>
+          <w:tcPr>
+            <w:tcW w:type="dxa" w:w="1701"/>
+            <w:shd w:val="clear" w:color="auto" w:fill="EDF7ED"/>
+          </w:tcPr>
+          <w:p>
+            <w:r>
+              <w:rPr>
+                <w:sz w:val="15"/>
+              </w:rPr>
+              <w:t>Admin listing detail</w:t>
+              <w:br/>
+              <w:t>with moderation</w:t>
+            </w:r>
+          </w:p>
+        </w:tc>
+        <w:tc>
+          <w:tcPr>
+            <w:tcW w:type="dxa" w:w="1984"/>
+            <w:shd w:val="clear" w:color="auto" w:fill="EDF7ED"/>
+          </w:tcPr>
+          <w:p>
+            <w:r>
+              <w:rPr>
+                <w:sz w:val="15"/>
+              </w:rPr>
+              <w:t>http://localhost:3000/resell/listings/l001</w:t>
+            </w:r>
+          </w:p>
+        </w:tc>
+      </w:tr>
+      <w:tr>
+        <w:tc>
+          <w:tcPr>
+            <w:tcW w:type="dxa" w:w="1247"/>
+            <w:shd w:val="clear" w:color="auto" w:fill="F3E5F5"/>
+          </w:tcPr>
+          <w:p>
+            <w:r>
+              <w:rPr>
+                <w:b/>
+                <w:color w:val="1A3A5C"/>
+                <w:sz w:val="15"/>
+              </w:rPr>
+              <w:t>A-13</w:t>
+            </w:r>
+          </w:p>
+        </w:tc>
+        <w:tc>
+          <w:tcPr>
+            <w:tcW w:type="dxa" w:w="1984"/>
+            <w:shd w:val="clear" w:color="auto" w:fill="F3E5F5"/>
+          </w:tcPr>
+          <w:p>
+            <w:r>
+              <w:rPr>
+                <w:sz w:val="15"/>
+              </w:rPr>
+              <w:t>ข้อพิพาท resell (Admin)</w:t>
+              <w:br/>
+              <w:t>/resell/disputes</w:t>
+            </w:r>
+          </w:p>
+        </w:tc>
+        <w:tc>
+          <w:tcPr>
+            <w:tcW w:type="dxa" w:w="1701"/>
+            <w:shd w:val="clear" w:color="auto" w:fill="F3E5F5"/>
+          </w:tcPr>
+          <w:p>
+            <w:r>
+              <w:rPr>
+                <w:sz w:val="15"/>
+              </w:rPr>
+              <w:t>Admin dashboard</w:t>
+              <w:br/>
+              <w:t>(เมื่อมี dispute ใหม่)</w:t>
+            </w:r>
+          </w:p>
+        </w:tc>
+        <w:tc>
+          <w:tcPr>
+            <w:tcW w:type="dxa" w:w="1984"/>
+            <w:shd w:val="clear" w:color="auto" w:fill="F3E5F5"/>
+          </w:tcPr>
+          <w:p>
+            <w:r>
+              <w:rPr>
+                <w:sz w:val="15"/>
+              </w:rPr>
+              <w:t>R6: buyer escalate seller timeout</w:t>
+              <w:br/>
+              <w:t>R8: inspection reject</w:t>
+              <w:br/>
+              <w:t>R9: admin ruling queue</w:t>
+              <w:br/>
+              <w:t>R11: damaged parcel</w:t>
+            </w:r>
+          </w:p>
+        </w:tc>
+        <w:tc>
+          <w:tcPr>
+            <w:tcW w:type="dxa" w:w="1701"/>
+            <w:shd w:val="clear" w:color="auto" w:fill="F3E5F5"/>
+          </w:tcPr>
+          <w:p>
+            <w:r>
+              <w:rPr>
+                <w:sz w:val="15"/>
+              </w:rPr>
+              <w:t>A-14 /resell/disputes/[id]</w:t>
+            </w:r>
+          </w:p>
+        </w:tc>
+        <w:tc>
+          <w:tcPr>
+            <w:tcW w:type="dxa" w:w="1814"/>
+            <w:shd w:val="clear" w:color="auto" w:fill="F3E5F5"/>
+          </w:tcPr>
+          <w:p>
+            <w:r>
+              <w:rPr>
+                <w:sz w:val="15"/>
+              </w:rPr>
+              <w:t>WeeeU :3002 U-26</w:t>
+              <w:br/>
+              <w:t>WeeeR :3001 R-22</w:t>
+            </w:r>
+          </w:p>
+        </w:tc>
+        <w:tc>
+          <w:tcPr>
+            <w:tcW w:type="dxa" w:w="907"/>
+            <w:shd w:val="clear" w:color="auto" w:fill="F3E5F5"/>
+          </w:tcPr>
+          <w:p>
+            <w:r>
+              <w:rPr>
+                <w:sz w:val="15"/>
+              </w:rPr>
+              <w:t>R6, R8, R9, R11</w:t>
+            </w:r>
+          </w:p>
+        </w:tc>
+        <w:tc>
+          <w:tcPr>
+            <w:tcW w:type="dxa" w:w="1701"/>
+            <w:shd w:val="clear" w:color="auto" w:fill="F3E5F5"/>
+          </w:tcPr>
+          <w:p>
+            <w:r>
+              <w:rPr>
+                <w:sz w:val="15"/>
+              </w:rPr>
+              <w:t>Admin dispute queue</w:t>
+            </w:r>
+          </w:p>
+        </w:tc>
+        <w:tc>
+          <w:tcPr>
+            <w:tcW w:type="dxa" w:w="1984"/>
+            <w:shd w:val="clear" w:color="auto" w:fill="F3E5F5"/>
+          </w:tcPr>
+          <w:p>
+            <w:r>
+              <w:rPr>
+                <w:sz w:val="15"/>
+              </w:rPr>
+              <w:t>http://localhost:3000/resell/disputes</w:t>
+            </w:r>
+          </w:p>
+        </w:tc>
+      </w:tr>
+      <w:tr>
+        <w:tc>
+          <w:tcPr>
+            <w:tcW w:type="dxa" w:w="1247"/>
+            <w:shd w:val="clear" w:color="auto" w:fill="E1F5FE"/>
+          </w:tcPr>
+          <w:p>
+            <w:r>
+              <w:rPr>
+                <w:b/>
+                <w:color w:val="1A3A5C"/>
+                <w:sz w:val="15"/>
+              </w:rPr>
+              <w:t>A-14</w:t>
+            </w:r>
+          </w:p>
+        </w:tc>
+        <w:tc>
+          <w:tcPr>
+            <w:tcW w:type="dxa" w:w="1984"/>
+            <w:shd w:val="clear" w:color="auto" w:fill="E1F5FE"/>
+          </w:tcPr>
+          <w:p>
+            <w:r>
+              <w:rPr>
+                <w:sz w:val="15"/>
+              </w:rPr>
+              <w:t>ตัดสินข้อพิพาท</w:t>
+              <w:br/>
+              <w:t>/resell/disputes/[id]</w:t>
+            </w:r>
+          </w:p>
+        </w:tc>
+        <w:tc>
+          <w:tcPr>
+            <w:tcW w:type="dxa" w:w="1701"/>
+            <w:shd w:val="clear" w:color="auto" w:fill="E1F5FE"/>
+          </w:tcPr>
+          <w:p>
+            <w:r>
+              <w:rPr>
+                <w:sz w:val="15"/>
+              </w:rPr>
+              <w:t>A-13 /resell/disputes</w:t>
+            </w:r>
+          </w:p>
+        </w:tc>
+        <w:tc>
+          <w:tcPr>
+            <w:tcW w:type="dxa" w:w="1984"/>
+            <w:shd w:val="clear" w:color="auto" w:fill="E1F5FE"/>
+          </w:tcPr>
+          <w:p>
+            <w:r>
+              <w:rPr>
+                <w:sz w:val="15"/>
+              </w:rPr>
+              <w:t>R9: Admin ตัดสิน dispute</w:t>
+              <w:br/>
+              <w:t>คืน Escrow / ปล่อย Gold</w:t>
+            </w:r>
+          </w:p>
+        </w:tc>
+        <w:tc>
+          <w:tcPr>
+            <w:tcW w:type="dxa" w:w="1701"/>
+            <w:shd w:val="clear" w:color="auto" w:fill="E1F5FE"/>
+          </w:tcPr>
+          <w:p>
+            <w:r>
+              <w:rPr>
+                <w:sz w:val="15"/>
+              </w:rPr>
+              <w:t>A-13 (resolved)</w:t>
+              <w:br/>
+              <w:t>🔗 WeeeU U-26 / WeeeR R-22</w:t>
+            </w:r>
+          </w:p>
+        </w:tc>
+        <w:tc>
+          <w:tcPr>
+            <w:tcW w:type="dxa" w:w="1814"/>
+            <w:shd w:val="clear" w:color="auto" w:fill="E1F5FE"/>
+          </w:tcPr>
+          <w:p>
+            <w:r>
+              <w:rPr>
+                <w:sz w:val="15"/>
+              </w:rPr>
+              <w:t>WeeeU :3002 U-26</w:t>
+              <w:br/>
+              <w:t>WeeeR :3001 R-22</w:t>
+            </w:r>
+          </w:p>
+        </w:tc>
+        <w:tc>
+          <w:tcPr>
+            <w:tcW w:type="dxa" w:w="907"/>
+            <w:shd w:val="clear" w:color="auto" w:fill="E1F5FE"/>
+          </w:tcPr>
+          <w:p>
+            <w:r>
+              <w:rPr>
+                <w:sz w:val="15"/>
+              </w:rPr>
+              <w:t>R9</w:t>
+            </w:r>
+          </w:p>
+        </w:tc>
+        <w:tc>
+          <w:tcPr>
+            <w:tcW w:type="dxa" w:w="1701"/>
+            <w:shd w:val="clear" w:color="auto" w:fill="E1F5FE"/>
+          </w:tcPr>
+          <w:p>
+            <w:r>
+              <w:rPr>
+                <w:sz w:val="15"/>
+              </w:rPr>
+              <w:t>Escrow release/return</w:t>
+              <w:br/>
+              <w:t>offer = SoT reference</w:t>
+            </w:r>
+          </w:p>
+        </w:tc>
+        <w:tc>
+          <w:tcPr>
+            <w:tcW w:type="dxa" w:w="1984"/>
+            <w:shd w:val="clear" w:color="auto" w:fill="E1F5FE"/>
+          </w:tcPr>
+          <w:p>
+            <w:r>
+              <w:rPr>
+                <w:sz w:val="15"/>
+              </w:rPr>
+              <w:t>http://localhost:3000/resell/disputes/o001</w:t>
+            </w:r>
+          </w:p>
+        </w:tc>
+      </w:tr>
+      <w:tr>
+        <w:tc>
+          <w:tcPr>
+            <w:tcW w:type="dxa" w:w="1247"/>
+            <w:shd w:val="clear" w:color="auto" w:fill="E8EAF6"/>
+          </w:tcPr>
+          <w:p>
+            <w:r>
+              <w:rPr>
+                <w:b/>
+                <w:color w:val="1A3A5C"/>
+                <w:sz w:val="15"/>
+              </w:rPr>
+              <w:t>A-37</w:t>
+            </w:r>
+          </w:p>
+        </w:tc>
+        <w:tc>
+          <w:tcPr>
+            <w:tcW w:type="dxa" w:w="1984"/>
+            <w:shd w:val="clear" w:color="auto" w:fill="E8EAF6"/>
+          </w:tcPr>
+          <w:p>
+            <w:r>
+              <w:rPr>
+                <w:sz w:val="15"/>
+              </w:rPr>
+              <w:t>Resell Lifecycle</w:t>
+              <w:br/>
+              <w:t>/resell/lifecycle</w:t>
+            </w:r>
+          </w:p>
+        </w:tc>
+        <w:tc>
+          <w:tcPr>
+            <w:tcW w:type="dxa" w:w="1701"/>
+            <w:shd w:val="clear" w:color="auto" w:fill="E8EAF6"/>
+          </w:tcPr>
+          <w:p>
+            <w:r>
+              <w:rPr>
+                <w:sz w:val="15"/>
+              </w:rPr>
+              <w:t>Admin dashboard</w:t>
+            </w:r>
+          </w:p>
+        </w:tc>
+        <w:tc>
+          <w:tcPr>
+            <w:tcW w:type="dxa" w:w="1984"/>
+            <w:shd w:val="clear" w:color="auto" w:fill="E8EAF6"/>
+          </w:tcPr>
+          <w:p>
+            <w:r>
+              <w:rPr>
+                <w:sz w:val="15"/>
+              </w:rPr>
+              <w:t>R10: Admin เฝ้าดู lifecycle</w:t>
+              <w:br/>
+              <w:t>ทุก transaction resell</w:t>
+            </w:r>
+          </w:p>
+        </w:tc>
+        <w:tc>
+          <w:tcPr>
+            <w:tcW w:type="dxa" w:w="1701"/>
+            <w:shd w:val="clear" w:color="auto" w:fill="E8EAF6"/>
+          </w:tcPr>
+          <w:p>
+            <w:r>
+              <w:rPr>
+                <w:sz w:val="15"/>
+              </w:rPr>
+              <w:t>A-13 (ถ้ามี issue)</w:t>
+            </w:r>
+          </w:p>
+        </w:tc>
+        <w:tc>
+          <w:tcPr>
+            <w:tcW w:type="dxa" w:w="1814"/>
+            <w:shd w:val="clear" w:color="auto" w:fill="E8EAF6"/>
+          </w:tcPr>
+          <w:p>
+            <w:r>
+              <w:rPr>
+                <w:sz w:val="15"/>
+              </w:rPr>
+              <w:t>WeeeU :3002 U-RES-REV</w:t>
+              <w:br/>
+              <w:t>WeeeR :3001 R-69b</w:t>
+            </w:r>
+          </w:p>
+        </w:tc>
+        <w:tc>
+          <w:tcPr>
+            <w:tcW w:type="dxa" w:w="907"/>
+            <w:shd w:val="clear" w:color="auto" w:fill="E8EAF6"/>
+          </w:tcPr>
+          <w:p>
+            <w:r>
+              <w:rPr>
+                <w:sz w:val="15"/>
+              </w:rPr>
+              <w:t>R10</w:t>
+            </w:r>
+          </w:p>
+        </w:tc>
+        <w:tc>
+          <w:tcPr>
+            <w:tcW w:type="dxa" w:w="1701"/>
+            <w:shd w:val="clear" w:color="auto" w:fill="E8EAF6"/>
+          </w:tcPr>
+          <w:p>
+            <w:r>
+              <w:rPr>
+                <w:sz w:val="15"/>
+              </w:rPr>
+              <w:t>Read-only observe screen</w:t>
+            </w:r>
+          </w:p>
+        </w:tc>
+        <w:tc>
+          <w:tcPr>
+            <w:tcW w:type="dxa" w:w="1984"/>
+            <w:shd w:val="clear" w:color="auto" w:fill="E8EAF6"/>
+          </w:tcPr>
+          <w:p>
+            <w:r>
+              <w:rPr>
+                <w:sz w:val="15"/>
+              </w:rPr>
+              <w:t>http://localhost:3000/resell/lifecycle</w:t>
+            </w:r>
+          </w:p>
+        </w:tc>
+      </w:tr>
+      <w:tr>
+        <w:tc>
+          <w:tcPr>
+            <w:tcW w:type="dxa" w:w="1247"/>
+            <w:shd w:val="clear" w:color="auto" w:fill="FFFFFF"/>
+          </w:tcPr>
+          <w:p>
+            <w:r>
+              <w:rPr>
+                <w:b/>
+                <w:color w:val="1A3A5C"/>
+                <w:sz w:val="15"/>
+              </w:rPr>
+              <w:t>A-34</w:t>
+            </w:r>
+          </w:p>
+        </w:tc>
+        <w:tc>
+          <w:tcPr>
+            <w:tcW w:type="dxa" w:w="1984"/>
+            <w:shd w:val="clear" w:color="auto" w:fill="FFFFFF"/>
+          </w:tcPr>
+          <w:p>
+            <w:r>
+              <w:rPr>
+                <w:sz w:val="15"/>
+              </w:rPr>
+              <w:t>ข้อเสนอ resell (Admin)</w:t>
+              <w:br/>
+              <w:t>/resell/offers</w:t>
+            </w:r>
+          </w:p>
+        </w:tc>
+        <w:tc>
+          <w:tcPr>
+            <w:tcW w:type="dxa" w:w="1701"/>
+            <w:shd w:val="clear" w:color="auto" w:fill="FFFFFF"/>
+          </w:tcPr>
+          <w:p>
+            <w:r>
+              <w:rPr>
+                <w:sz w:val="15"/>
+              </w:rPr>
+              <w:t>Admin dashboard</w:t>
+            </w:r>
+          </w:p>
+        </w:tc>
+        <w:tc>
+          <w:tcPr>
+            <w:tcW w:type="dxa" w:w="1984"/>
+            <w:shd w:val="clear" w:color="auto" w:fill="FFFFFF"/>
+          </w:tcPr>
+          <w:p>
+            <w:r>
+              <w:rPr>
+                <w:sz w:val="15"/>
+              </w:rPr>
+              <w:t>Admin ดู offer ทั้งหมด</w:t>
+              <w:br/>
+              <w:t>ใน resell (audit/monitoring)</w:t>
+            </w:r>
+          </w:p>
+        </w:tc>
+        <w:tc>
+          <w:tcPr>
+            <w:tcW w:type="dxa" w:w="1701"/>
+            <w:shd w:val="clear" w:color="auto" w:fill="FFFFFF"/>
+          </w:tcPr>
+          <w:p>
+            <w:r>
+              <w:rPr>
+                <w:sz w:val="15"/>
+              </w:rPr>
+              <w:t>A-12b (ดู listing ที่ offer)</w:t>
+            </w:r>
+          </w:p>
+        </w:tc>
+        <w:tc>
+          <w:tcPr>
+            <w:tcW w:type="dxa" w:w="1814"/>
+            <w:shd w:val="clear" w:color="auto" w:fill="FFFFFF"/>
+          </w:tcPr>
+          <w:p>
+            <w:r>
+              <w:rPr>
+                <w:sz w:val="15"/>
+              </w:rPr>
+              <w:t>—</w:t>
+            </w:r>
+          </w:p>
+        </w:tc>
+        <w:tc>
+          <w:tcPr>
+            <w:tcW w:type="dxa" w:w="907"/>
+            <w:shd w:val="clear" w:color="auto" w:fill="FFFFFF"/>
+          </w:tcPr>
+          <w:p>
+            <w:r>
+              <w:rPr>
+                <w:sz w:val="15"/>
+              </w:rPr>
+              <w:t>นอก chain</w:t>
+            </w:r>
+          </w:p>
+        </w:tc>
+        <w:tc>
+          <w:tcPr>
+            <w:tcW w:type="dxa" w:w="1701"/>
+            <w:shd w:val="clear" w:color="auto" w:fill="FFFFFF"/>
+          </w:tcPr>
+          <w:p>
+            <w:r>
+              <w:rPr>
+                <w:sz w:val="15"/>
+              </w:rPr>
+              <w:t>Admin offer audit</w:t>
+            </w:r>
+          </w:p>
+        </w:tc>
+        <w:tc>
+          <w:tcPr>
+            <w:tcW w:type="dxa" w:w="1984"/>
+            <w:shd w:val="clear" w:color="auto" w:fill="FFFFFF"/>
+          </w:tcPr>
+          <w:p>
+            <w:r>
+              <w:rPr>
+                <w:sz w:val="15"/>
+              </w:rPr>
+              <w:t>http://localhost:3000/resell/offers</w:t>
+            </w:r>
+          </w:p>
+        </w:tc>
+      </w:tr>
+      <w:tr>
+        <w:tc>
+          <w:tcPr>
+            <w:tcW w:type="dxa" w:w="1247"/>
+            <w:shd w:val="clear" w:color="auto" w:fill="F8F8F8"/>
+          </w:tcPr>
+          <w:p>
+            <w:r>
+              <w:rPr>
+                <w:b/>
+                <w:color w:val="1A3A5C"/>
+                <w:sz w:val="15"/>
+              </w:rPr>
+              <w:t>A-35</w:t>
+            </w:r>
+          </w:p>
+        </w:tc>
+        <w:tc>
+          <w:tcPr>
+            <w:tcW w:type="dxa" w:w="1984"/>
+            <w:shd w:val="clear" w:color="auto" w:fill="F8F8F8"/>
+          </w:tcPr>
+          <w:p>
+            <w:r>
+              <w:rPr>
+                <w:sz w:val="15"/>
+              </w:rPr>
+              <w:t>งาน resell (Admin)</w:t>
+              <w:br/>
+              <w:t>/resell/jobs</w:t>
+            </w:r>
+          </w:p>
+        </w:tc>
+        <w:tc>
+          <w:tcPr>
+            <w:tcW w:type="dxa" w:w="1701"/>
+            <w:shd w:val="clear" w:color="auto" w:fill="F8F8F8"/>
+          </w:tcPr>
+          <w:p>
+            <w:r>
+              <w:rPr>
+                <w:sz w:val="15"/>
+              </w:rPr>
+              <w:t>Admin dashboard</w:t>
+            </w:r>
+          </w:p>
+        </w:tc>
+        <w:tc>
+          <w:tcPr>
+            <w:tcW w:type="dxa" w:w="1984"/>
+            <w:shd w:val="clear" w:color="auto" w:fill="F8F8F8"/>
+          </w:tcPr>
+          <w:p>
+            <w:r>
+              <w:rPr>
+                <w:sz w:val="15"/>
+              </w:rPr>
+              <w:t>Admin ดูงาน resell</w:t>
+              <w:br/>
+              <w:t>ที่อยู่ระหว่างดำเนินการ</w:t>
+            </w:r>
+          </w:p>
+        </w:tc>
+        <w:tc>
+          <w:tcPr>
+            <w:tcW w:type="dxa" w:w="1701"/>
+            <w:shd w:val="clear" w:color="auto" w:fill="F8F8F8"/>
+          </w:tcPr>
+          <w:p>
+            <w:r>
+              <w:rPr>
+                <w:sz w:val="15"/>
+              </w:rPr>
+              <w:t>A-35b /resell/jobs/[id]</w:t>
+            </w:r>
+          </w:p>
+        </w:tc>
+        <w:tc>
+          <w:tcPr>
+            <w:tcW w:type="dxa" w:w="1814"/>
+            <w:shd w:val="clear" w:color="auto" w:fill="F8F8F8"/>
+          </w:tcPr>
+          <w:p>
+            <w:r>
+              <w:rPr>
+                <w:sz w:val="15"/>
+              </w:rPr>
+              <w:t>—</w:t>
+            </w:r>
+          </w:p>
+        </w:tc>
+        <w:tc>
+          <w:tcPr>
+            <w:tcW w:type="dxa" w:w="907"/>
+            <w:shd w:val="clear" w:color="auto" w:fill="F8F8F8"/>
+          </w:tcPr>
+          <w:p>
+            <w:r>
+              <w:rPr>
+                <w:sz w:val="15"/>
+              </w:rPr>
+              <w:t>นอก chain</w:t>
+            </w:r>
+          </w:p>
+        </w:tc>
+        <w:tc>
+          <w:tcPr>
+            <w:tcW w:type="dxa" w:w="1701"/>
+            <w:shd w:val="clear" w:color="auto" w:fill="F8F8F8"/>
+          </w:tcPr>
+          <w:p>
+            <w:r>
+              <w:rPr>
+                <w:sz w:val="15"/>
+              </w:rPr>
+              <w:t>Admin jobs overview</w:t>
+            </w:r>
+          </w:p>
+        </w:tc>
+        <w:tc>
+          <w:tcPr>
+            <w:tcW w:type="dxa" w:w="1984"/>
+            <w:shd w:val="clear" w:color="auto" w:fill="F8F8F8"/>
+          </w:tcPr>
+          <w:p>
+            <w:r>
+              <w:rPr>
+                <w:sz w:val="15"/>
+              </w:rPr>
+              <w:t>http://localhost:3000/resell/jobs</w:t>
+            </w:r>
+          </w:p>
+        </w:tc>
+      </w:tr>
+      <w:tr>
+        <w:tc>
+          <w:tcPr>
+            <w:tcW w:type="dxa" w:w="1247"/>
+            <w:shd w:val="clear" w:color="auto" w:fill="FFFFFF"/>
+          </w:tcPr>
+          <w:p>
+            <w:r>
+              <w:rPr>
+                <w:b/>
+                <w:color w:val="1A3A5C"/>
+                <w:sz w:val="15"/>
+              </w:rPr>
+              <w:t>A-35b</w:t>
+            </w:r>
+          </w:p>
+        </w:tc>
+        <w:tc>
+          <w:tcPr>
+            <w:tcW w:type="dxa" w:w="1984"/>
+            <w:shd w:val="clear" w:color="auto" w:fill="FFFFFF"/>
+          </w:tcPr>
+          <w:p>
+            <w:r>
+              <w:rPr>
+                <w:sz w:val="15"/>
+              </w:rPr>
+              <w:t>รายละเอียดงาน resell</w:t>
+              <w:br/>
+              <w:t>/resell/jobs/[id]</w:t>
+            </w:r>
+          </w:p>
+        </w:tc>
+        <w:tc>
+          <w:tcPr>
+            <w:tcW w:type="dxa" w:w="1701"/>
+            <w:shd w:val="clear" w:color="auto" w:fill="FFFFFF"/>
+          </w:tcPr>
+          <w:p>
+            <w:r>
+              <w:rPr>
+                <w:sz w:val="15"/>
+              </w:rPr>
+              <w:t>A-35 /resell/jobs</w:t>
+            </w:r>
+          </w:p>
+        </w:tc>
+        <w:tc>
+          <w:tcPr>
+            <w:tcW w:type="dxa" w:w="1984"/>
+            <w:shd w:val="clear" w:color="auto" w:fill="FFFFFF"/>
+          </w:tcPr>
+          <w:p>
+            <w:r>
+              <w:rPr>
+                <w:sz w:val="15"/>
+              </w:rPr>
+              <w:t>Admin ดูรายละเอียดงาน resell</w:t>
+            </w:r>
+          </w:p>
+        </w:tc>
+        <w:tc>
+          <w:tcPr>
+            <w:tcW w:type="dxa" w:w="1701"/>
+            <w:shd w:val="clear" w:color="auto" w:fill="FFFFFF"/>
+          </w:tcPr>
+          <w:p>
+            <w:r>
+              <w:rPr>
+                <w:sz w:val="15"/>
+              </w:rPr>
+              <w:t>A-35 (กลับ)</w:t>
+            </w:r>
+          </w:p>
+        </w:tc>
+        <w:tc>
+          <w:tcPr>
+            <w:tcW w:type="dxa" w:w="1814"/>
+            <w:shd w:val="clear" w:color="auto" w:fill="FFFFFF"/>
+          </w:tcPr>
+          <w:p>
+            <w:r>
+              <w:rPr>
+                <w:sz w:val="15"/>
+              </w:rPr>
+              <w:t>WeeeU :3002 U-19c</w:t>
+              <w:br/>
+              <w:t>WeeeR :3001 R-23</w:t>
+            </w:r>
+          </w:p>
+        </w:tc>
+        <w:tc>
+          <w:tcPr>
+            <w:tcW w:type="dxa" w:w="907"/>
+            <w:shd w:val="clear" w:color="auto" w:fill="FFFFFF"/>
+          </w:tcPr>
+          <w:p>
+            <w:r>
+              <w:rPr>
+                <w:sz w:val="15"/>
+              </w:rPr>
+              <w:t>นอก chain</w:t>
+            </w:r>
+          </w:p>
+        </w:tc>
+        <w:tc>
+          <w:tcPr>
+            <w:tcW w:type="dxa" w:w="1701"/>
+            <w:shd w:val="clear" w:color="auto" w:fill="FFFFFF"/>
+          </w:tcPr>
+          <w:p>
+            <w:r>
+              <w:rPr>
+                <w:sz w:val="15"/>
+              </w:rPr>
+              <w:t>Admin job detail</w:t>
+            </w:r>
+          </w:p>
+        </w:tc>
+        <w:tc>
+          <w:tcPr>
+            <w:tcW w:type="dxa" w:w="1984"/>
+            <w:shd w:val="clear" w:color="auto" w:fill="FFFFFF"/>
+          </w:tcPr>
+          <w:p>
+            <w:r>
+              <w:rPr>
+                <w:sz w:val="15"/>
+              </w:rPr>
+              <w:t>http://localhost:3000/resell/jobs/o001</w:t>
+            </w:r>
+          </w:p>
+        </w:tc>
+      </w:tr>
+      <w:tr>
+        <w:tc>
+          <w:tcPr>
+            <w:tcW w:type="dxa" w:w="1247"/>
+            <w:shd w:val="clear" w:color="auto" w:fill="F8F8F8"/>
+          </w:tcPr>
+          <w:p>
+            <w:r>
+              <w:rPr>
+                <w:b/>
+                <w:color w:val="1A3A5C"/>
+                <w:sz w:val="15"/>
+              </w:rPr>
+              <w:t>A-36</w:t>
+            </w:r>
+          </w:p>
+        </w:tc>
+        <w:tc>
+          <w:tcPr>
+            <w:tcW w:type="dxa" w:w="1984"/>
+            <w:shd w:val="clear" w:color="auto" w:fill="F8F8F8"/>
+          </w:tcPr>
+          <w:p>
+            <w:r>
+              <w:rPr>
+                <w:sz w:val="15"/>
+              </w:rPr>
+              <w:t>ค่าธรรมเนียม resell</w:t>
+              <w:br/>
+              <w:t>/resell/fees</w:t>
+            </w:r>
+          </w:p>
+        </w:tc>
+        <w:tc>
+          <w:tcPr>
+            <w:tcW w:type="dxa" w:w="1701"/>
+            <w:shd w:val="clear" w:color="auto" w:fill="F8F8F8"/>
+          </w:tcPr>
+          <w:p>
+            <w:r>
+              <w:rPr>
+                <w:sz w:val="15"/>
+              </w:rPr>
+              <w:t>Admin dashboard</w:t>
+            </w:r>
+          </w:p>
+        </w:tc>
+        <w:tc>
+          <w:tcPr>
+            <w:tcW w:type="dxa" w:w="1984"/>
+            <w:shd w:val="clear" w:color="auto" w:fill="F8F8F8"/>
+          </w:tcPr>
+          <w:p>
+            <w:r>
+              <w:rPr>
+                <w:sz w:val="15"/>
+              </w:rPr>
+              <w:t>Admin ดู/แก้ไขอัตราค่าธรรมเนียม</w:t>
+              <w:br/>
+              <w:t>D-code D-Resell-1 (remove from heading)</w:t>
+            </w:r>
+          </w:p>
+        </w:tc>
+        <w:tc>
+          <w:tcPr>
+            <w:tcW w:type="dxa" w:w="1701"/>
+            <w:shd w:val="clear" w:color="auto" w:fill="F8F8F8"/>
+          </w:tcPr>
+          <w:p>
+            <w:r>
+              <w:rPr>
+                <w:sz w:val="15"/>
+              </w:rPr>
+              <w:t>—</w:t>
+            </w:r>
+          </w:p>
+        </w:tc>
+        <w:tc>
+          <w:tcPr>
+            <w:tcW w:type="dxa" w:w="1814"/>
+            <w:shd w:val="clear" w:color="auto" w:fill="F8F8F8"/>
+          </w:tcPr>
+          <w:p>
+            <w:r>
+              <w:rPr>
+                <w:sz w:val="15"/>
+              </w:rPr>
+              <w:t>—</w:t>
+            </w:r>
+          </w:p>
+        </w:tc>
+        <w:tc>
+          <w:tcPr>
+            <w:tcW w:type="dxa" w:w="907"/>
+            <w:shd w:val="clear" w:color="auto" w:fill="F8F8F8"/>
+          </w:tcPr>
+          <w:p>
+            <w:r>
+              <w:rPr>
+                <w:sz w:val="15"/>
+              </w:rPr>
+              <w:t>นอก chain</w:t>
+            </w:r>
+          </w:p>
+        </w:tc>
+        <w:tc>
+          <w:tcPr>
+            <w:tcW w:type="dxa" w:w="1701"/>
+            <w:shd w:val="clear" w:color="auto" w:fill="F8F8F8"/>
+          </w:tcPr>
+          <w:p>
+            <w:r>
+              <w:rPr>
+                <w:sz w:val="15"/>
+              </w:rPr>
+              <w:t>D-Resell-1 ใน h1:168/h2:191</w:t>
+              <w:br/>
+              <w:t>→ MockAnno overlay (gap)</w:t>
+            </w:r>
+          </w:p>
+        </w:tc>
+        <w:tc>
+          <w:tcPr>
+            <w:tcW w:type="dxa" w:w="1984"/>
+            <w:shd w:val="clear" w:color="auto" w:fill="F8F8F8"/>
+          </w:tcPr>
+          <w:p>
+            <w:r>
+              <w:rPr>
+                <w:sz w:val="15"/>
+              </w:rPr>
+              <w:t>http://localhost:3000/resell/fees</w:t>
+            </w:r>
+          </w:p>
+        </w:tc>
+      </w:tr>
+      <w:tr>
+        <w:tc>
+          <w:tcPr>
+            <w:tcW w:type="dxa" w:w="1247"/>
+            <w:shd w:val="clear" w:color="auto" w:fill="FFFFFF"/>
+          </w:tcPr>
+          <w:p>
+            <w:r>
+              <w:rPr>
+                <w:b/>
+                <w:color w:val="1A3A5C"/>
+                <w:sz w:val="15"/>
+              </w:rPr>
+              <w:t>A-38</w:t>
+            </w:r>
+          </w:p>
+        </w:tc>
+        <w:tc>
+          <w:tcPr>
+            <w:tcW w:type="dxa" w:w="1984"/>
+            <w:shd w:val="clear" w:color="auto" w:fill="FFFFFF"/>
+          </w:tcPr>
+          <w:p>
+            <w:r>
+              <w:rPr>
+                <w:sz w:val="15"/>
+              </w:rPr>
+              <w:t>Resell Analytics</w:t>
+              <w:br/>
+              <w:t>/resell/analytics</w:t>
+            </w:r>
+          </w:p>
+        </w:tc>
+        <w:tc>
+          <w:tcPr>
+            <w:tcW w:type="dxa" w:w="1701"/>
+            <w:shd w:val="clear" w:color="auto" w:fill="FFFFFF"/>
+          </w:tcPr>
+          <w:p>
+            <w:r>
+              <w:rPr>
+                <w:sz w:val="15"/>
+              </w:rPr>
+              <w:t>Admin dashboard</w:t>
+            </w:r>
+          </w:p>
+        </w:tc>
+        <w:tc>
+          <w:tcPr>
+            <w:tcW w:type="dxa" w:w="1984"/>
+            <w:shd w:val="clear" w:color="auto" w:fill="FFFFFF"/>
+          </w:tcPr>
+          <w:p>
+            <w:r>
+              <w:rPr>
+                <w:sz w:val="15"/>
+              </w:rPr>
+              <w:t>Admin ดู analytics ของ resell</w:t>
+              <w:br/>
+              <w:t>(volume/revenue/disputes)</w:t>
+            </w:r>
+          </w:p>
+        </w:tc>
+        <w:tc>
+          <w:tcPr>
+            <w:tcW w:type="dxa" w:w="1701"/>
+            <w:shd w:val="clear" w:color="auto" w:fill="FFFFFF"/>
+          </w:tcPr>
+          <w:p>
+            <w:r>
+              <w:rPr>
+                <w:sz w:val="15"/>
+              </w:rPr>
+              <w:t>A-13 / A-12</w:t>
+            </w:r>
+          </w:p>
+        </w:tc>
+        <w:tc>
+          <w:tcPr>
+            <w:tcW w:type="dxa" w:w="1814"/>
+            <w:shd w:val="clear" w:color="auto" w:fill="FFFFFF"/>
+          </w:tcPr>
+          <w:p>
+            <w:r>
+              <w:rPr>
+                <w:sz w:val="15"/>
+              </w:rPr>
+              <w:t>—</w:t>
+            </w:r>
+          </w:p>
+        </w:tc>
+        <w:tc>
+          <w:tcPr>
+            <w:tcW w:type="dxa" w:w="907"/>
+            <w:shd w:val="clear" w:color="auto" w:fill="FFFFFF"/>
+          </w:tcPr>
+          <w:p>
+            <w:r>
+              <w:rPr>
+                <w:sz w:val="15"/>
+              </w:rPr>
+              <w:t>นอก chain</w:t>
+            </w:r>
+          </w:p>
+        </w:tc>
+        <w:tc>
+          <w:tcPr>
+            <w:tcW w:type="dxa" w:w="1701"/>
+            <w:shd w:val="clear" w:color="auto" w:fill="FFFFFF"/>
+          </w:tcPr>
+          <w:p>
+            <w:r>
+              <w:rPr>
+                <w:sz w:val="15"/>
+              </w:rPr>
+              <w:t>Read-only analytics</w:t>
+            </w:r>
+          </w:p>
+        </w:tc>
+        <w:tc>
+          <w:tcPr>
+            <w:tcW w:type="dxa" w:w="1984"/>
+            <w:shd w:val="clear" w:color="auto" w:fill="FFFFFF"/>
+          </w:tcPr>
+          <w:p>
+            <w:r>
+              <w:rPr>
+                <w:sz w:val="15"/>
+              </w:rPr>
+              <w:t>http://localhost:3000/resell/analytics</w:t>
+            </w:r>
+          </w:p>
+        </w:tc>
+      </w:tr>
+      <w:tr>
+        <w:tc>
+          <w:tcPr>
+            <w:tcW w:type="dxa" w:w="1247"/>
+            <w:shd w:val="clear" w:color="auto" w:fill="1565C0"/>
+          </w:tcPr>
+          <w:p>
+            <w:r>
+              <w:rPr>
+                <w:b/>
+                <w:color w:val="FFFFFF"/>
+                <w:sz w:val="17"/>
+              </w:rPr>
+              <w:t>🌐 Website (localhost:3004) — 2 จอ · D71 Public Entry (anonymous)</w:t>
+            </w:r>
+          </w:p>
+        </w:tc>
+        <w:tc>
+          <w:tcPr>
+            <w:tcW w:type="dxa" w:w="1984"/>
+            <w:shd w:val="clear" w:color="auto" w:fill="1565C0"/>
+          </w:tcPr>
+          <w:p/>
+        </w:tc>
+        <w:tc>
+          <w:tcPr>
+            <w:tcW w:type="dxa" w:w="1701"/>
+            <w:shd w:val="clear" w:color="auto" w:fill="1565C0"/>
+          </w:tcPr>
+          <w:p/>
+        </w:tc>
+        <w:tc>
+          <w:tcPr>
+            <w:tcW w:type="dxa" w:w="1984"/>
+            <w:shd w:val="clear" w:color="auto" w:fill="1565C0"/>
+          </w:tcPr>
+          <w:p/>
+        </w:tc>
+        <w:tc>
+          <w:tcPr>
+            <w:tcW w:type="dxa" w:w="1701"/>
+            <w:shd w:val="clear" w:color="auto" w:fill="1565C0"/>
+          </w:tcPr>
+          <w:p/>
+        </w:tc>
+        <w:tc>
+          <w:tcPr>
+            <w:tcW w:type="dxa" w:w="1814"/>
+            <w:shd w:val="clear" w:color="auto" w:fill="1565C0"/>
+          </w:tcPr>
+          <w:p/>
+        </w:tc>
+        <w:tc>
+          <w:tcPr>
+            <w:tcW w:type="dxa" w:w="907"/>
+            <w:shd w:val="clear" w:color="auto" w:fill="1565C0"/>
+          </w:tcPr>
+          <w:p/>
+        </w:tc>
+        <w:tc>
+          <w:tcPr>
+            <w:tcW w:type="dxa" w:w="1701"/>
+            <w:shd w:val="clear" w:color="auto" w:fill="1565C0"/>
+          </w:tcPr>
+          <w:p/>
+        </w:tc>
+        <w:tc>
+          <w:tcPr>
+            <w:tcW w:type="dxa" w:w="1984"/>
+            <w:shd w:val="clear" w:color="auto" w:fill="1565C0"/>
+          </w:tcPr>
+          <w:p/>
+        </w:tc>
+      </w:tr>
+      <w:tr>
+        <w:tc>
+          <w:tcPr>
+            <w:tcW w:type="dxa" w:w="1247"/>
+            <w:shd w:val="clear" w:color="auto" w:fill="EDF7ED"/>
+          </w:tcPr>
+          <w:p>
+            <w:r>
+              <w:rPr>
+                <w:b/>
+                <w:color w:val="1A3A5C"/>
+                <w:sz w:val="15"/>
+              </w:rPr>
+              <w:t>W-11</w:t>
+            </w:r>
+          </w:p>
+        </w:tc>
+        <w:tc>
+          <w:tcPr>
+            <w:tcW w:type="dxa" w:w="1984"/>
+            <w:shd w:val="clear" w:color="auto" w:fill="EDF7ED"/>
+          </w:tcPr>
+          <w:p>
+            <w:r>
+              <w:rPr>
+                <w:sz w:val="15"/>
+              </w:rPr>
+              <w:t>ตลาดสาธารณะ D71</w:t>
+              <w:br/>
+              <w:t>/listings/resell</w:t>
+            </w:r>
+          </w:p>
+        </w:tc>
+        <w:tc>
+          <w:tcPr>
+            <w:tcW w:type="dxa" w:w="1701"/>
+            <w:shd w:val="clear" w:color="auto" w:fill="EDF7ED"/>
+          </w:tcPr>
+          <w:p>
+            <w:r>
+              <w:rPr>
+                <w:sz w:val="15"/>
+              </w:rPr>
+              <w:t>W-01 /home (Website)</w:t>
+              <w:br/>
+              <w:t>W-09 /listings</w:t>
+              <w:br/>
+              <w:t>Direct URL (anonymous)</w:t>
+            </w:r>
+          </w:p>
+        </w:tc>
+        <w:tc>
+          <w:tcPr>
+            <w:tcW w:type="dxa" w:w="1984"/>
+            <w:shd w:val="clear" w:color="auto" w:fill="EDF7ED"/>
+          </w:tcPr>
+          <w:p>
+            <w:r>
+              <w:rPr>
+                <w:sz w:val="15"/>
+              </w:rPr>
+              <w:t>R1: ประกาศ WeeeU/WeeeR</w:t>
+              <w:br/>
+              <w:t>เผยแพร่ขึ้น Website สาธารณะ</w:t>
+              <w:br/>
+              <w:t>D71: anonymous เห็นรูป+ราคา</w:t>
+            </w:r>
+          </w:p>
+        </w:tc>
+        <w:tc>
+          <w:tcPr>
+            <w:tcW w:type="dxa" w:w="1701"/>
+            <w:shd w:val="clear" w:color="auto" w:fill="EDF7ED"/>
+          </w:tcPr>
+          <w:p>
+            <w:r>
+              <w:rPr>
+                <w:sz w:val="15"/>
+              </w:rPr>
+              <w:t>W-12 /listings/resell/[id]</w:t>
+              <w:br/>
+              <w:t>WeeeU :3002 U-21 (Login→marketplace)</w:t>
+            </w:r>
+          </w:p>
+        </w:tc>
+        <w:tc>
+          <w:tcPr>
+            <w:tcW w:type="dxa" w:w="1814"/>
+            <w:shd w:val="clear" w:color="auto" w:fill="EDF7ED"/>
+          </w:tcPr>
+          <w:p>
+            <w:r>
+              <w:rPr>
+                <w:sz w:val="15"/>
+              </w:rPr>
+              <w:t>WeeeU :3002 U-47a (listings)</w:t>
+              <w:br/>
+              <w:t>WeeeR :3001 R-41 (WeeeR listings)</w:t>
+            </w:r>
+          </w:p>
+        </w:tc>
+        <w:tc>
+          <w:tcPr>
+            <w:tcW w:type="dxa" w:w="907"/>
+            <w:shd w:val="clear" w:color="auto" w:fill="EDF7ED"/>
+          </w:tcPr>
+          <w:p>
+            <w:r>
+              <w:rPr>
+                <w:sz w:val="15"/>
+              </w:rPr>
+              <w:t>R1</w:t>
+              <w:br/>
+              <w:t>(in-chain entry)</w:t>
+            </w:r>
+          </w:p>
+        </w:tc>
+        <w:tc>
+          <w:tcPr>
+            <w:tcW w:type="dxa" w:w="1701"/>
+            <w:shd w:val="clear" w:color="auto" w:fill="EDF7ED"/>
+          </w:tcPr>
+          <w:p>
+            <w:r>
+              <w:rPr>
+                <w:sz w:val="15"/>
+              </w:rPr>
+              <w:t>D71 public override</w:t>
+              <w:br/>
+              <w:t>anonymous = no auth</w:t>
+              <w:br/>
+              <w:t>Login → redirect WeeeU</w:t>
+            </w:r>
+          </w:p>
+        </w:tc>
+        <w:tc>
+          <w:tcPr>
+            <w:tcW w:type="dxa" w:w="1984"/>
+            <w:shd w:val="clear" w:color="auto" w:fill="EDF7ED"/>
+          </w:tcPr>
+          <w:p>
+            <w:r>
+              <w:rPr>
+                <w:sz w:val="15"/>
+              </w:rPr>
+              <w:t>http://localhost:3004/listings/resell</w:t>
+            </w:r>
+          </w:p>
+        </w:tc>
+      </w:tr>
+      <w:tr>
+        <w:tc>
+          <w:tcPr>
+            <w:tcW w:type="dxa" w:w="1247"/>
+            <w:shd w:val="clear" w:color="auto" w:fill="EDF7ED"/>
+          </w:tcPr>
+          <w:p>
+            <w:r>
+              <w:rPr>
+                <w:b/>
+                <w:color w:val="1A3A5C"/>
+                <w:sz w:val="15"/>
+              </w:rPr>
+              <w:t>W-12</w:t>
+            </w:r>
+          </w:p>
+        </w:tc>
+        <w:tc>
+          <w:tcPr>
+            <w:tcW w:type="dxa" w:w="1984"/>
+            <w:shd w:val="clear" w:color="auto" w:fill="EDF7ED"/>
+          </w:tcPr>
+          <w:p>
+            <w:r>
+              <w:rPr>
+                <w:sz w:val="15"/>
+              </w:rPr>
+              <w:t>รายละเอียด D71</w:t>
+              <w:br/>
+              <w:t>/listings/resell/[id]</w:t>
+            </w:r>
+          </w:p>
+        </w:tc>
+        <w:tc>
+          <w:tcPr>
+            <w:tcW w:type="dxa" w:w="1701"/>
+            <w:shd w:val="clear" w:color="auto" w:fill="EDF7ED"/>
+          </w:tcPr>
+          <w:p>
+            <w:r>
+              <w:rPr>
+                <w:sz w:val="15"/>
+              </w:rPr>
+              <w:t>W-11 /listings/resell</w:t>
+            </w:r>
+          </w:p>
+        </w:tc>
+        <w:tc>
+          <w:tcPr>
+            <w:tcW w:type="dxa" w:w="1984"/>
+            <w:shd w:val="clear" w:color="auto" w:fill="EDF7ED"/>
+          </w:tcPr>
+          <w:p>
+            <w:r>
+              <w:rPr>
+                <w:sz w:val="15"/>
+              </w:rPr>
+              <w:t>R1/R2: รายละเอียดประกาศบน Website</w:t>
+              <w:br/>
+              <w:t>R2 branch: /suspended state</w:t>
+            </w:r>
+          </w:p>
+        </w:tc>
+        <w:tc>
+          <w:tcPr>
+            <w:tcW w:type="dxa" w:w="1701"/>
+            <w:shd w:val="clear" w:color="auto" w:fill="EDF7ED"/>
+          </w:tcPr>
+          <w:p>
+            <w:r>
+              <w:rPr>
+                <w:sz w:val="15"/>
+              </w:rPr>
+              <w:t>WeeeU :3002 U-22 (Login + offer)</w:t>
+              <w:br/>
+              <w:t>W-11 (กลับ)</w:t>
+            </w:r>
+          </w:p>
+        </w:tc>
+        <w:tc>
+          <w:tcPr>
+            <w:tcW w:type="dxa" w:w="1814"/>
+            <w:shd w:val="clear" w:color="auto" w:fill="EDF7ED"/>
+          </w:tcPr>
+          <w:p>
+            <w:r>
+              <w:rPr>
+                <w:sz w:val="15"/>
+              </w:rPr>
+              <w:t>WeeeU :3002 U-47c (seller detail)</w:t>
+            </w:r>
+          </w:p>
+        </w:tc>
+        <w:tc>
+          <w:tcPr>
+            <w:tcW w:type="dxa" w:w="907"/>
+            <w:shd w:val="clear" w:color="auto" w:fill="EDF7ED"/>
+          </w:tcPr>
+          <w:p>
+            <w:r>
+              <w:rPr>
+                <w:sz w:val="15"/>
+              </w:rPr>
+              <w:t>R1, R2</w:t>
+              <w:br/>
+              <w:t>(in-chain entry)</w:t>
+            </w:r>
+          </w:p>
+        </w:tc>
+        <w:tc>
+          <w:tcPr>
+            <w:tcW w:type="dxa" w:w="1701"/>
+            <w:shd w:val="clear" w:color="auto" w:fill="EDF7ED"/>
+          </w:tcPr>
+          <w:p>
+            <w:r>
+              <w:rPr>
+                <w:sz w:val="15"/>
+              </w:rPr>
+              <w:t>D71 public detail</w:t>
+              <w:br/>
+              <w:t>R2 branch: /suspended</w:t>
+              <w:br/>
+              <w:t>CTA → Login WeeeU</w:t>
+            </w:r>
+          </w:p>
+        </w:tc>
+        <w:tc>
+          <w:tcPr>
+            <w:tcW w:type="dxa" w:w="1984"/>
+            <w:shd w:val="clear" w:color="auto" w:fill="EDF7ED"/>
+          </w:tcPr>
+          <w:p>
+            <w:r>
+              <w:rPr>
+                <w:sz w:val="15"/>
+              </w:rPr>
+              <w:t>http://localhost:3004/listings/resell/l001</w:t>
             </w:r>
           </w:p>
         </w:tc>

</xml_diff>